<commit_message>
Fill brief with facts from the live site
Adds company scale (40 experts, 400+ clients, 15 years), public metrics,
legal details, business-size segmentation and the Premium service question,
plus a description of the undocumented visual vocabulary already used on
1-plus-1.ru. Audience section now records that 75% of clients arrive by
referral, which reprioritises the deliverables.
</commit_message>
<xml_diff>
--- a/docs/Бриф_на_брендбук_1+1.docx
+++ b/docs/Бриф_на_брендбук_1+1.docx
@@ -120,7 +120,7 @@
                 <w:sz w:val="20"/>
                 <w:szCs w:val="20"/>
               </w:rPr>
-              <w:t xml:space="preserve">Разделы 1–4 уже заполнены — это фактура о компании. Пункты, отмеченные знаком ▢, заполняет заказчик: без ответов на них подрядчик будет угадывать, и результат окажется случайным.</w:t>
+              <w:t xml:space="preserve">Разделы 1–4 уже заполнены — это фактура о компании и то, что есть сейчас. Пункты, отмеченные знаком ▢, заполняет заказчик: без ответов на них подрядчик будет угадывать, и результат окажется случайным.</w:t>
             </w:r>
           </w:p>
         </w:tc>
@@ -192,7 +192,7 @@
           <w:sz w:val="21"/>
           <w:szCs w:val="21"/>
         </w:rPr>
-        <w:t xml:space="preserve">Сейчас у компании есть логотип и сайт. Системы визуальной коммуникации нет: каждый носитель (пост, презентация, коммерческое предложение, документ) собирается заново и по-своему, поэтому материалы не читаются как один бренд, а на подготовку каждого макета уходит лишнее время.</w:t>
+        <w:t xml:space="preserve">Сейчас у компании есть логотип и сайт. Описанной системы визуальной коммуникации нет: часть решений живёт внутри вёрстки сайта и нигде не зафиксирована, поэтому каждый носитель — пост, презентация, коммерческое предложение, документ — собирается заново и по-своему. В результате материалы не читаются как один бренд, а на подготовку каждого макета уходит лишнее время.</w:t>
       </w:r>
     </w:p>
     <w:p>
@@ -475,7 +475,7 @@
                 <w:sz w:val="20"/>
                 <w:szCs w:val="20"/>
               </w:rPr>
-              <w:t xml:space="preserve">Дескриптор</w:t>
+              <w:t xml:space="preserve">Юридическое лицо</w:t>
             </w:r>
           </w:p>
         </w:tc>
@@ -501,7 +501,7 @@
                 <w:sz w:val="20"/>
                 <w:szCs w:val="20"/>
               </w:rPr>
-              <w:t xml:space="preserve">Аутсорсинг бухгалтерии</w:t>
+              <w:t xml:space="preserve">ООО «1+1», ИНН 2263026027, ОГРН 1112208001025</w:t>
             </w:r>
           </w:p>
         </w:tc>
@@ -533,7 +533,7 @@
                 <w:sz w:val="20"/>
                 <w:szCs w:val="20"/>
               </w:rPr>
-              <w:t xml:space="preserve">Сфера</w:t>
+              <w:t xml:space="preserve">Дескриптор</w:t>
             </w:r>
           </w:p>
         </w:tc>
@@ -559,7 +559,7 @@
                 <w:sz w:val="20"/>
                 <w:szCs w:val="20"/>
               </w:rPr>
-              <w:t xml:space="preserve">Бухгалтерский аутсорсинг, налоговый и финансовый консалтинг, юридическое сопровождение бизнеса</w:t>
+              <w:t xml:space="preserve">Аутсорсинг бухгалтерии</w:t>
             </w:r>
           </w:p>
         </w:tc>
@@ -591,7 +591,7 @@
                 <w:sz w:val="20"/>
                 <w:szCs w:val="20"/>
               </w:rPr>
-              <w:t xml:space="preserve">На рынке с</w:t>
+              <w:t xml:space="preserve">Сфера</w:t>
             </w:r>
           </w:p>
         </w:tc>
@@ -607,7 +607,7 @@
           </w:tcPr>
           <w:p>
             <w:pPr>
-              <w:spacing w:after="0" w:line="264"/>
+              <w:spacing w:after="60" w:line="264"/>
             </w:pPr>
             <w:r>
               <w:rPr>
@@ -617,7 +617,22 @@
                 <w:sz w:val="20"/>
                 <w:szCs w:val="20"/>
               </w:rPr>
-              <w:t xml:space="preserve">2011 года</w:t>
+              <w:t xml:space="preserve">Бухгалтерский аутсорсинг, налоговый и финансовый консалтинг,</w:t>
+            </w:r>
+          </w:p>
+          <w:p>
+            <w:pPr>
+              <w:spacing w:after="0" w:line="264"/>
+            </w:pPr>
+            <w:r>
+              <w:rPr>
+                <w:b w:val="false"/>
+                <w:bCs w:val="false"/>
+                <w:color w:val="1A1A1A"/>
+                <w:sz w:val="20"/>
+                <w:szCs w:val="20"/>
+              </w:rPr>
+              <w:t xml:space="preserve">юридическое сопровождение бизнеса</w:t>
             </w:r>
           </w:p>
         </w:tc>
@@ -649,7 +664,7 @@
                 <w:sz w:val="20"/>
                 <w:szCs w:val="20"/>
               </w:rPr>
-              <w:t xml:space="preserve">География</w:t>
+              <w:t xml:space="preserve">На рынке</w:t>
             </w:r>
           </w:p>
         </w:tc>
@@ -675,7 +690,7 @@
                 <w:sz w:val="20"/>
                 <w:szCs w:val="20"/>
               </w:rPr>
-              <w:t xml:space="preserve">Барнаул, Алтайский край; обслуживание клиентов дистанционно</w:t>
+              <w:t xml:space="preserve">15 лет, с 2011 года</w:t>
             </w:r>
           </w:p>
         </w:tc>
@@ -707,7 +722,7 @@
                 <w:sz w:val="20"/>
                 <w:szCs w:val="20"/>
               </w:rPr>
-              <w:t xml:space="preserve">Сайт</w:t>
+              <w:t xml:space="preserve">Команда</w:t>
             </w:r>
           </w:p>
         </w:tc>
@@ -733,7 +748,7 @@
                 <w:sz w:val="20"/>
                 <w:szCs w:val="20"/>
               </w:rPr>
-              <w:t xml:space="preserve">1-plus-1.ru</w:t>
+              <w:t xml:space="preserve">40 экспертов</w:t>
             </w:r>
           </w:p>
         </w:tc>
@@ -765,7 +780,7 @@
                 <w:sz w:val="20"/>
                 <w:szCs w:val="20"/>
               </w:rPr>
-              <w:t xml:space="preserve">Собственный продукт</w:t>
+              <w:t xml:space="preserve">Клиентская база</w:t>
             </w:r>
           </w:p>
         </w:tc>
@@ -791,12 +806,377 @@
                 <w:sz w:val="20"/>
                 <w:szCs w:val="20"/>
               </w:rPr>
+              <w:t xml:space="preserve">более 400 клиентов</w:t>
+            </w:r>
+          </w:p>
+        </w:tc>
+      </w:tr>
+      <w:tr>
+        <w:trPr>
+          <w:cantSplit/>
+          <w:tblHeader w:val="false"/>
+        </w:trPr>
+        <w:tc>
+          <w:tcPr>
+            <w:tcW w:type="dxa" w:w="2400"/>
+            <w:tcMar>
+              <w:top w:type="dxa" w:w="90"/>
+              <w:left w:type="dxa" w:w="120"/>
+              <w:bottom w:type="dxa" w:w="90"/>
+              <w:right w:type="dxa" w:w="120"/>
+            </w:tcMar>
+          </w:tcPr>
+          <w:p>
+            <w:pPr>
+              <w:spacing w:after="0" w:line="264"/>
+            </w:pPr>
+            <w:r>
+              <w:rPr>
+                <w:b w:val="false"/>
+                <w:bCs w:val="false"/>
+                <w:color w:val="1A1A1A"/>
+                <w:sz w:val="20"/>
+                <w:szCs w:val="20"/>
+              </w:rPr>
+              <w:t xml:space="preserve">География</w:t>
+            </w:r>
+          </w:p>
+        </w:tc>
+        <w:tc>
+          <w:tcPr>
+            <w:tcW w:type="dxa" w:w="7300"/>
+            <w:tcMar>
+              <w:top w:type="dxa" w:w="90"/>
+              <w:left w:type="dxa" w:w="120"/>
+              <w:bottom w:type="dxa" w:w="90"/>
+              <w:right w:type="dxa" w:w="120"/>
+            </w:tcMar>
+          </w:tcPr>
+          <w:p>
+            <w:pPr>
+              <w:spacing w:after="0" w:line="264"/>
+            </w:pPr>
+            <w:r>
+              <w:rPr>
+                <w:b w:val="false"/>
+                <w:bCs w:val="false"/>
+                <w:color w:val="1A1A1A"/>
+                <w:sz w:val="20"/>
+                <w:szCs w:val="20"/>
+              </w:rPr>
+              <w:t xml:space="preserve">Барнаул, ул. Пролетарская, 92; клиенты обслуживаются дистанционно</w:t>
+            </w:r>
+          </w:p>
+        </w:tc>
+      </w:tr>
+      <w:tr>
+        <w:trPr>
+          <w:cantSplit/>
+          <w:tblHeader w:val="false"/>
+        </w:trPr>
+        <w:tc>
+          <w:tcPr>
+            <w:tcW w:type="dxa" w:w="2400"/>
+            <w:tcMar>
+              <w:top w:type="dxa" w:w="90"/>
+              <w:left w:type="dxa" w:w="120"/>
+              <w:bottom w:type="dxa" w:w="90"/>
+              <w:right w:type="dxa" w:w="120"/>
+            </w:tcMar>
+          </w:tcPr>
+          <w:p>
+            <w:pPr>
+              <w:spacing w:after="0" w:line="264"/>
+            </w:pPr>
+            <w:r>
+              <w:rPr>
+                <w:b w:val="false"/>
+                <w:bCs w:val="false"/>
+                <w:color w:val="1A1A1A"/>
+                <w:sz w:val="20"/>
+                <w:szCs w:val="20"/>
+              </w:rPr>
+              <w:t xml:space="preserve">Сайт</w:t>
+            </w:r>
+          </w:p>
+        </w:tc>
+        <w:tc>
+          <w:tcPr>
+            <w:tcW w:type="dxa" w:w="7300"/>
+            <w:tcMar>
+              <w:top w:type="dxa" w:w="90"/>
+              <w:left w:type="dxa" w:w="120"/>
+              <w:bottom w:type="dxa" w:w="90"/>
+              <w:right w:type="dxa" w:w="120"/>
+            </w:tcMar>
+          </w:tcPr>
+          <w:p>
+            <w:pPr>
+              <w:spacing w:after="0" w:line="264"/>
+            </w:pPr>
+            <w:r>
+              <w:rPr>
+                <w:b w:val="false"/>
+                <w:bCs w:val="false"/>
+                <w:color w:val="1A1A1A"/>
+                <w:sz w:val="20"/>
+                <w:szCs w:val="20"/>
+              </w:rPr>
+              <w:t xml:space="preserve">1-plus-1.ru</w:t>
+            </w:r>
+          </w:p>
+        </w:tc>
+      </w:tr>
+      <w:tr>
+        <w:trPr>
+          <w:cantSplit/>
+          <w:tblHeader w:val="false"/>
+        </w:trPr>
+        <w:tc>
+          <w:tcPr>
+            <w:tcW w:type="dxa" w:w="2400"/>
+            <w:tcMar>
+              <w:top w:type="dxa" w:w="90"/>
+              <w:left w:type="dxa" w:w="120"/>
+              <w:bottom w:type="dxa" w:w="90"/>
+              <w:right w:type="dxa" w:w="120"/>
+            </w:tcMar>
+          </w:tcPr>
+          <w:p>
+            <w:pPr>
+              <w:spacing w:after="0" w:line="264"/>
+            </w:pPr>
+            <w:r>
+              <w:rPr>
+                <w:b w:val="false"/>
+                <w:bCs w:val="false"/>
+                <w:color w:val="1A1A1A"/>
+                <w:sz w:val="20"/>
+                <w:szCs w:val="20"/>
+              </w:rPr>
+              <w:t xml:space="preserve">Соцсети</w:t>
+            </w:r>
+          </w:p>
+        </w:tc>
+        <w:tc>
+          <w:tcPr>
+            <w:tcW w:type="dxa" w:w="7300"/>
+            <w:tcMar>
+              <w:top w:type="dxa" w:w="90"/>
+              <w:left w:type="dxa" w:w="120"/>
+              <w:bottom w:type="dxa" w:w="90"/>
+              <w:right w:type="dxa" w:w="120"/>
+            </w:tcMar>
+          </w:tcPr>
+          <w:p>
+            <w:pPr>
+              <w:spacing w:after="0" w:line="264"/>
+            </w:pPr>
+            <w:r>
+              <w:rPr>
+                <w:b w:val="false"/>
+                <w:bCs w:val="false"/>
+                <w:color w:val="1A1A1A"/>
+                <w:sz w:val="20"/>
+                <w:szCs w:val="20"/>
+              </w:rPr>
+              <w:t xml:space="preserve">ВКонтакте, Telegram</w:t>
+            </w:r>
+          </w:p>
+        </w:tc>
+      </w:tr>
+      <w:tr>
+        <w:trPr>
+          <w:cantSplit/>
+          <w:tblHeader w:val="false"/>
+        </w:trPr>
+        <w:tc>
+          <w:tcPr>
+            <w:tcW w:type="dxa" w:w="2400"/>
+            <w:tcMar>
+              <w:top w:type="dxa" w:w="90"/>
+              <w:left w:type="dxa" w:w="120"/>
+              <w:bottom w:type="dxa" w:w="90"/>
+              <w:right w:type="dxa" w:w="120"/>
+            </w:tcMar>
+          </w:tcPr>
+          <w:p>
+            <w:pPr>
+              <w:spacing w:after="0" w:line="264"/>
+            </w:pPr>
+            <w:r>
+              <w:rPr>
+                <w:b w:val="false"/>
+                <w:bCs w:val="false"/>
+                <w:color w:val="1A1A1A"/>
+                <w:sz w:val="20"/>
+                <w:szCs w:val="20"/>
+              </w:rPr>
+              <w:t xml:space="preserve">Собственный продукт</w:t>
+            </w:r>
+          </w:p>
+        </w:tc>
+        <w:tc>
+          <w:tcPr>
+            <w:tcW w:type="dxa" w:w="7300"/>
+            <w:tcMar>
+              <w:top w:type="dxa" w:w="90"/>
+              <w:left w:type="dxa" w:w="120"/>
+              <w:bottom w:type="dxa" w:w="90"/>
+              <w:right w:type="dxa" w:w="120"/>
+            </w:tcMar>
+          </w:tcPr>
+          <w:p>
+            <w:pPr>
+              <w:spacing w:after="0" w:line="264"/>
+            </w:pPr>
+            <w:r>
+              <w:rPr>
+                <w:b w:val="false"/>
+                <w:bCs w:val="false"/>
+                <w:color w:val="1A1A1A"/>
+                <w:sz w:val="20"/>
+                <w:szCs w:val="20"/>
+              </w:rPr>
               <w:t xml:space="preserve">онлайн-сервис «Бухдеск»</w:t>
             </w:r>
           </w:p>
         </w:tc>
       </w:tr>
     </w:tbl>
+    <w:p>
+      <w:pPr>
+        <w:spacing w:after="140"/>
+      </w:pPr>
+      <w:r>
+        <w:rPr>
+          <w:color w:val="1A1A1A"/>
+          <w:sz w:val="21"/>
+          <w:szCs w:val="21"/>
+        </w:rPr>
+        <w:t xml:space="preserve"/>
+      </w:r>
+    </w:p>
+    <w:p>
+      <w:pPr>
+        <w:pStyle w:val="Heading2"/>
+        <w:keepNext/>
+        <w:spacing w:after="90" w:before="220"/>
+      </w:pPr>
+      <w:r>
+        <w:rPr>
+          <w:b/>
+          <w:bCs/>
+          <w:color w:val="8A8443"/>
+          <w:sz w:val="22"/>
+          <w:szCs w:val="22"/>
+        </w:rPr>
+        <w:t xml:space="preserve">Показатели, которые компания заявляет публично</w:t>
+      </w:r>
+    </w:p>
+    <w:p>
+      <w:pPr>
+        <w:spacing w:after="120" w:line="276"/>
+      </w:pPr>
+      <w:r>
+        <w:rPr>
+          <w:color w:val="1A1A1A"/>
+          <w:sz w:val="21"/>
+          <w:szCs w:val="21"/>
+        </w:rPr>
+        <w:t xml:space="preserve">Это отдельный тип контента: крупные числа в блоке «Компания в цифрах», в презентациях и в соцсетях. Стиль должен уметь их подавать.</w:t>
+      </w:r>
+    </w:p>
+    <w:p>
+      <w:pPr>
+        <w:pStyle w:val="ListParagraph"/>
+        <w:numPr>
+          <w:ilvl w:val="0"/>
+          <w:numId w:val="2"/>
+        </w:numPr>
+        <w:spacing w:after="60" w:line="276"/>
+      </w:pPr>
+      <w:r>
+        <w:rPr>
+          <w:color w:val="1A1A1A"/>
+          <w:sz w:val="21"/>
+          <w:szCs w:val="21"/>
+        </w:rPr>
+        <w:t xml:space="preserve">40 экспертов в команде</w:t>
+      </w:r>
+    </w:p>
+    <w:p>
+      <w:pPr>
+        <w:pStyle w:val="ListParagraph"/>
+        <w:numPr>
+          <w:ilvl w:val="0"/>
+          <w:numId w:val="2"/>
+        </w:numPr>
+        <w:spacing w:after="60" w:line="276"/>
+      </w:pPr>
+      <w:r>
+        <w:rPr>
+          <w:color w:val="1A1A1A"/>
+          <w:sz w:val="21"/>
+          <w:szCs w:val="21"/>
+        </w:rPr>
+        <w:t xml:space="preserve">Более 400 клиентов, из них 75% пришли по рекомендации</w:t>
+      </w:r>
+    </w:p>
+    <w:p>
+      <w:pPr>
+        <w:pStyle w:val="ListParagraph"/>
+        <w:numPr>
+          <w:ilvl w:val="0"/>
+          <w:numId w:val="2"/>
+        </w:numPr>
+        <w:spacing w:after="60" w:line="276"/>
+      </w:pPr>
+      <w:r>
+        <w:rPr>
+          <w:color w:val="1A1A1A"/>
+          <w:sz w:val="21"/>
+          <w:szCs w:val="21"/>
+        </w:rPr>
+        <w:t xml:space="preserve">2,1 млн рублей налогов сэкономлено клиентам за 2025 год</w:t>
+      </w:r>
+    </w:p>
+    <w:p>
+      <w:pPr>
+        <w:pStyle w:val="ListParagraph"/>
+        <w:numPr>
+          <w:ilvl w:val="0"/>
+          <w:numId w:val="2"/>
+        </w:numPr>
+        <w:spacing w:after="60" w:line="276"/>
+      </w:pPr>
+      <w:r>
+        <w:rPr>
+          <w:color w:val="1A1A1A"/>
+          <w:sz w:val="21"/>
+          <w:szCs w:val="21"/>
+        </w:rPr>
+        <w:t xml:space="preserve">230 консультаций и 25 обучений за 2025 год</w:t>
+      </w:r>
+    </w:p>
+    <w:p>
+      <w:pPr>
+        <w:pStyle w:val="ListParagraph"/>
+        <w:numPr>
+          <w:ilvl w:val="0"/>
+          <w:numId w:val="2"/>
+        </w:numPr>
+        <w:spacing w:after="60" w:line="276"/>
+      </w:pPr>
+      <w:r>
+        <w:rPr>
+          <w:color w:val="1A1A1A"/>
+          <w:sz w:val="21"/>
+          <w:szCs w:val="21"/>
+        </w:rPr>
+        <w:t xml:space="preserve">Профессиональная ответственность застрахована на 10 000 000 рублей, полис «Ингосстрах»</w:t>
+      </w:r>
+    </w:p>
     <w:p>
       <w:pPr>
         <w:spacing w:after="120"/>
@@ -862,7 +1242,7 @@
                 <w:sz w:val="21"/>
                 <w:szCs w:val="21"/>
               </w:rPr>
-              <w:t xml:space="preserve">Масштаб компании: сколько сотрудников, сколько клиентов на обслуживании, есть ли офисы в других городах</w:t>
+              <w:t xml:space="preserve">Планы на 2–3 года, которые стиль должен выдержать</w:t>
             </w:r>
           </w:p>
           <w:p>
@@ -878,7 +1258,1246 @@
                 <w:sz w:val="19"/>
                 <w:szCs w:val="19"/>
               </w:rPr>
-              <w:t xml:space="preserve">Подрядчику это нужно, чтобы понимать уровень: стиль небольшой команды и стиль федеральной компании выглядят по-разному.</w:t>
+              <w:t xml:space="preserve">Например: выход в другие регионы, развитие «Бухдеска» как отдельного продукта, франшиза, работа с более крупным бизнесом. Если это планируется — стиль нужно закладывать с запасом.</w:t>
+            </w:r>
+          </w:p>
+          <w:p>
+            <w:pPr>
+              <w:spacing w:after="60"/>
+              <w:ind w:left="260"/>
+            </w:pPr>
+            <w:r>
+              <w:rPr>
+                <w:sz w:val="21"/>
+                <w:szCs w:val="21"/>
+              </w:rPr>
+              <w:t xml:space="preserve"> </w:t>
+            </w:r>
+          </w:p>
+        </w:tc>
+      </w:tr>
+    </w:tbl>
+    <w:p>
+      <w:pPr>
+        <w:pStyle w:val="Heading1"/>
+        <w:keepNext/>
+        <w:pBdr>
+          <w:bottom w:val="single" w:color="D63F61" w:sz="8" w:space="6"/>
+        </w:pBdr>
+        <w:spacing w:after="140" w:before="400"/>
+      </w:pPr>
+      <w:r>
+        <w:rPr>
+          <w:b/>
+          <w:bCs/>
+          <w:color w:val="D63F61"/>
+          <w:sz w:val="26"/>
+          <w:szCs w:val="26"/>
+        </w:rPr>
+        <w:t xml:space="preserve">3  </w:t>
+      </w:r>
+      <w:r>
+        <w:rPr>
+          <w:b/>
+          <w:bCs/>
+          <w:color w:val="1A1A1A"/>
+          <w:sz w:val="26"/>
+          <w:szCs w:val="26"/>
+        </w:rPr>
+        <w:t xml:space="preserve">Услуги и структура предложения</w:t>
+      </w:r>
+    </w:p>
+    <w:p>
+      <w:pPr>
+        <w:pStyle w:val="Heading2"/>
+        <w:keepNext/>
+        <w:spacing w:after="90" w:before="220"/>
+      </w:pPr>
+      <w:r>
+        <w:rPr>
+          <w:b/>
+          <w:bCs/>
+          <w:color w:val="8A8443"/>
+          <w:sz w:val="22"/>
+          <w:szCs w:val="22"/>
+        </w:rPr>
+        <w:t xml:space="preserve">Сегментация по размеру бизнеса</w:t>
+      </w:r>
+    </w:p>
+    <w:p>
+      <w:pPr>
+        <w:spacing w:after="120" w:line="276"/>
+      </w:pPr>
+      <w:r>
+        <w:rPr>
+          <w:color w:val="1A1A1A"/>
+          <w:sz w:val="21"/>
+          <w:szCs w:val="21"/>
+        </w:rPr>
+        <w:t xml:space="preserve">Услуги разделены на три пакета. Стиль должен уметь показывать их как разные уровни одного бренда, а не как три разных оформления:</w:t>
+      </w:r>
+    </w:p>
+    <w:p>
+      <w:pPr>
+        <w:pStyle w:val="ListParagraph"/>
+        <w:numPr>
+          <w:ilvl w:val="0"/>
+          <w:numId w:val="2"/>
+        </w:numPr>
+        <w:spacing w:after="60" w:line="276"/>
+      </w:pPr>
+      <w:r>
+        <w:rPr>
+          <w:color w:val="1A1A1A"/>
+          <w:sz w:val="21"/>
+          <w:szCs w:val="21"/>
+        </w:rPr>
+        <w:t xml:space="preserve">Для малого бизнеса</w:t>
+      </w:r>
+    </w:p>
+    <w:p>
+      <w:pPr>
+        <w:pStyle w:val="ListParagraph"/>
+        <w:numPr>
+          <w:ilvl w:val="0"/>
+          <w:numId w:val="2"/>
+        </w:numPr>
+        <w:spacing w:after="60" w:line="276"/>
+      </w:pPr>
+      <w:r>
+        <w:rPr>
+          <w:color w:val="1A1A1A"/>
+          <w:sz w:val="21"/>
+          <w:szCs w:val="21"/>
+        </w:rPr>
+        <w:t xml:space="preserve">Для среднего бизнеса</w:t>
+      </w:r>
+    </w:p>
+    <w:p>
+      <w:pPr>
+        <w:pStyle w:val="ListParagraph"/>
+        <w:numPr>
+          <w:ilvl w:val="0"/>
+          <w:numId w:val="2"/>
+        </w:numPr>
+        <w:spacing w:after="60" w:line="276"/>
+      </w:pPr>
+      <w:r>
+        <w:rPr>
+          <w:color w:val="1A1A1A"/>
+          <w:sz w:val="21"/>
+          <w:szCs w:val="21"/>
+        </w:rPr>
+        <w:t xml:space="preserve">Для крупного бизнеса</w:t>
+      </w:r>
+    </w:p>
+    <w:p>
+      <w:pPr>
+        <w:spacing w:after="60"/>
+      </w:pPr>
+      <w:r>
+        <w:rPr>
+          <w:color w:val="1A1A1A"/>
+          <w:sz w:val="21"/>
+          <w:szCs w:val="21"/>
+        </w:rPr>
+        <w:t xml:space="preserve"/>
+      </w:r>
+    </w:p>
+    <w:p>
+      <w:pPr>
+        <w:spacing w:after="120" w:line="276"/>
+      </w:pPr>
+      <w:r>
+        <w:rPr>
+          <w:color w:val="1A1A1A"/>
+          <w:sz w:val="21"/>
+          <w:szCs w:val="21"/>
+        </w:rPr>
+        <w:t xml:space="preserve">Отдельно вынесен «Премиум-сервис» — в навигации сайта он выделен цветом как особое предложение.</w:t>
+      </w:r>
+    </w:p>
+    <w:tbl>
+      <w:tblPr>
+        <w:tblW w:type="dxa" w:w="9700"/>
+        <w:tblBorders>
+          <w:top w:val="single" w:color="E8D5DA" w:sz="4"/>
+          <w:left w:val="single" w:color="D63F61" w:sz="18"/>
+          <w:bottom w:val="single" w:color="E8D5DA" w:sz="4"/>
+          <w:right w:val="single" w:color="E8D5DA" w:sz="4"/>
+          <w:insideH w:val="none" w:color="FFFFFF" w:sz="0"/>
+          <w:insideV w:val="none" w:color="FFFFFF" w:sz="0"/>
+        </w:tblBorders>
+      </w:tblPr>
+      <w:tblGrid>
+        <w:gridCol w:w="9700"/>
+      </w:tblGrid>
+      <w:tr>
+        <w:trPr>
+          <w:cantSplit/>
+        </w:trPr>
+        <w:tc>
+          <w:tcPr>
+            <w:tcW w:type="dxa" w:w="9700"/>
+            <w:shd w:fill="FDF9F9" w:val="clear"/>
+            <w:tcMar>
+              <w:top w:type="dxa" w:w="100"/>
+              <w:left w:type="dxa" w:w="160"/>
+              <w:bottom w:type="dxa" w:w="100"/>
+              <w:right w:type="dxa" w:w="160"/>
+            </w:tcMar>
+          </w:tcPr>
+          <w:p>
+            <w:pPr>
+              <w:spacing w:after="40" w:before="60"/>
+            </w:pPr>
+            <w:r>
+              <w:rPr>
+                <w:b/>
+                <w:bCs/>
+                <w:color w:val="D63F61"/>
+                <w:sz w:val="21"/>
+                <w:szCs w:val="21"/>
+              </w:rPr>
+              <w:t xml:space="preserve">▢  </w:t>
+            </w:r>
+            <w:r>
+              <w:rPr>
+                <w:b/>
+                <w:bCs/>
+                <w:color w:val="1A1A1A"/>
+                <w:sz w:val="21"/>
+                <w:szCs w:val="21"/>
+              </w:rPr>
+              <w:t xml:space="preserve">«Премиум-сервис» — это отдельный продукт со своим лицом или просто более дорогой тариф</w:t>
+            </w:r>
+          </w:p>
+          <w:p>
+            <w:pPr>
+              <w:spacing w:after="100"/>
+              <w:ind w:left="260"/>
+            </w:pPr>
+            <w:r>
+              <w:rPr>
+                <w:i/>
+                <w:iCs/>
+                <w:color w:val="6E6E6E"/>
+                <w:sz w:val="19"/>
+                <w:szCs w:val="19"/>
+              </w:rPr>
+              <w:t xml:space="preserve">От ответа зависит архитектура бренда: либо для него разрабатывается собственный визуальный уровень — цвет, оформление, материалы, — либо он подаётся так же, как остальные услуги.</w:t>
+            </w:r>
+          </w:p>
+          <w:p>
+            <w:pPr>
+              <w:spacing w:after="60"/>
+              <w:ind w:left="260"/>
+            </w:pPr>
+            <w:r>
+              <w:rPr>
+                <w:sz w:val="21"/>
+                <w:szCs w:val="21"/>
+              </w:rPr>
+              <w:t xml:space="preserve"> </w:t>
+            </w:r>
+          </w:p>
+        </w:tc>
+      </w:tr>
+    </w:tbl>
+    <w:p>
+      <w:pPr>
+        <w:pStyle w:val="Heading2"/>
+        <w:keepNext/>
+        <w:spacing w:after="90" w:before="220"/>
+      </w:pPr>
+      <w:r>
+        <w:rPr>
+          <w:b/>
+          <w:bCs/>
+          <w:color w:val="8A8443"/>
+          <w:sz w:val="22"/>
+          <w:szCs w:val="22"/>
+        </w:rPr>
+        <w:t xml:space="preserve">Направления услуг</w:t>
+      </w:r>
+    </w:p>
+    <w:p>
+      <w:pPr>
+        <w:spacing w:after="120" w:line="276"/>
+      </w:pPr>
+      <w:r>
+        <w:rPr>
+          <w:color w:val="1A1A1A"/>
+          <w:sz w:val="21"/>
+          <w:szCs w:val="21"/>
+        </w:rPr>
+        <w:t xml:space="preserve">Их нужно уметь визуально различать: иконки, разделы сайта, презентации, папки документов.</w:t>
+      </w:r>
+    </w:p>
+    <w:p>
+      <w:pPr>
+        <w:pStyle w:val="ListParagraph"/>
+        <w:numPr>
+          <w:ilvl w:val="0"/>
+          <w:numId w:val="2"/>
+        </w:numPr>
+        <w:spacing w:after="60" w:line="276"/>
+      </w:pPr>
+      <w:r>
+        <w:rPr>
+          <w:color w:val="1A1A1A"/>
+          <w:sz w:val="21"/>
+          <w:szCs w:val="21"/>
+        </w:rPr>
+        <w:t xml:space="preserve">Бухгалтерское обслуживание на аутсорсе</w:t>
+      </w:r>
+    </w:p>
+    <w:p>
+      <w:pPr>
+        <w:pStyle w:val="ListParagraph"/>
+        <w:numPr>
+          <w:ilvl w:val="0"/>
+          <w:numId w:val="2"/>
+        </w:numPr>
+        <w:spacing w:after="60" w:line="276"/>
+      </w:pPr>
+      <w:r>
+        <w:rPr>
+          <w:color w:val="1A1A1A"/>
+          <w:sz w:val="21"/>
+          <w:szCs w:val="21"/>
+        </w:rPr>
+        <w:t xml:space="preserve">Налоговый консалтинг и оптимизация налогообложения</w:t>
+      </w:r>
+    </w:p>
+    <w:p>
+      <w:pPr>
+        <w:pStyle w:val="ListParagraph"/>
+        <w:numPr>
+          <w:ilvl w:val="0"/>
+          <w:numId w:val="2"/>
+        </w:numPr>
+        <w:spacing w:after="60" w:line="276"/>
+      </w:pPr>
+      <w:r>
+        <w:rPr>
+          <w:color w:val="1A1A1A"/>
+          <w:sz w:val="21"/>
+          <w:szCs w:val="21"/>
+        </w:rPr>
+        <w:t xml:space="preserve">Финансовый консалтинг, управленческий учёт</w:t>
+      </w:r>
+    </w:p>
+    <w:p>
+      <w:pPr>
+        <w:pStyle w:val="ListParagraph"/>
+        <w:numPr>
+          <w:ilvl w:val="0"/>
+          <w:numId w:val="2"/>
+        </w:numPr>
+        <w:spacing w:after="60" w:line="276"/>
+      </w:pPr>
+      <w:r>
+        <w:rPr>
+          <w:color w:val="1A1A1A"/>
+          <w:sz w:val="21"/>
+          <w:szCs w:val="21"/>
+        </w:rPr>
+        <w:t xml:space="preserve">Юридическое сопровождение бизнеса</w:t>
+      </w:r>
+    </w:p>
+    <w:p>
+      <w:pPr>
+        <w:pStyle w:val="ListParagraph"/>
+        <w:numPr>
+          <w:ilvl w:val="0"/>
+          <w:numId w:val="2"/>
+        </w:numPr>
+        <w:spacing w:after="60" w:line="276"/>
+      </w:pPr>
+      <w:r>
+        <w:rPr>
+          <w:color w:val="1A1A1A"/>
+          <w:sz w:val="21"/>
+          <w:szCs w:val="21"/>
+        </w:rPr>
+        <w:t xml:space="preserve">Регистрация и ликвидация бизнеса</w:t>
+      </w:r>
+    </w:p>
+    <w:p>
+      <w:pPr>
+        <w:pStyle w:val="ListParagraph"/>
+        <w:numPr>
+          <w:ilvl w:val="0"/>
+          <w:numId w:val="2"/>
+        </w:numPr>
+        <w:spacing w:after="60" w:line="276"/>
+      </w:pPr>
+      <w:r>
+        <w:rPr>
+          <w:color w:val="1A1A1A"/>
+          <w:sz w:val="21"/>
+          <w:szCs w:val="21"/>
+        </w:rPr>
+        <w:t xml:space="preserve">Кадровый учёт, расчёт заработной платы</w:t>
+      </w:r>
+    </w:p>
+    <w:p>
+      <w:pPr>
+        <w:pStyle w:val="ListParagraph"/>
+        <w:numPr>
+          <w:ilvl w:val="0"/>
+          <w:numId w:val="2"/>
+        </w:numPr>
+        <w:spacing w:after="60" w:line="276"/>
+      </w:pPr>
+      <w:r>
+        <w:rPr>
+          <w:color w:val="1A1A1A"/>
+          <w:sz w:val="21"/>
+          <w:szCs w:val="21"/>
+        </w:rPr>
+        <w:t xml:space="preserve">Воинский учёт</w:t>
+      </w:r>
+    </w:p>
+    <w:p>
+      <w:pPr>
+        <w:pStyle w:val="ListParagraph"/>
+        <w:numPr>
+          <w:ilvl w:val="0"/>
+          <w:numId w:val="2"/>
+        </w:numPr>
+        <w:spacing w:after="60" w:line="276"/>
+      </w:pPr>
+      <w:r>
+        <w:rPr>
+          <w:color w:val="1A1A1A"/>
+          <w:sz w:val="21"/>
+          <w:szCs w:val="21"/>
+        </w:rPr>
+        <w:t xml:space="preserve">Регистрация товарных знаков</w:t>
+      </w:r>
+    </w:p>
+    <w:p>
+      <w:pPr>
+        <w:pStyle w:val="ListParagraph"/>
+        <w:numPr>
+          <w:ilvl w:val="0"/>
+          <w:numId w:val="2"/>
+        </w:numPr>
+        <w:spacing w:after="60" w:line="276"/>
+      </w:pPr>
+      <w:r>
+        <w:rPr>
+          <w:color w:val="1A1A1A"/>
+          <w:sz w:val="21"/>
+          <w:szCs w:val="21"/>
+        </w:rPr>
+        <w:t xml:space="preserve">Декларации 3-НДФЛ для физических лиц</w:t>
+      </w:r>
+    </w:p>
+    <w:p>
+      <w:pPr>
+        <w:spacing w:after="80"/>
+      </w:pPr>
+      <w:r>
+        <w:rPr>
+          <w:color w:val="1A1A1A"/>
+          <w:sz w:val="21"/>
+          <w:szCs w:val="21"/>
+        </w:rPr>
+        <w:t xml:space="preserve"/>
+      </w:r>
+    </w:p>
+    <w:tbl>
+      <w:tblPr>
+        <w:tblW w:type="dxa" w:w="9700"/>
+        <w:tblBorders>
+          <w:top w:val="single" w:color="E8D5DA" w:sz="4"/>
+          <w:left w:val="single" w:color="D63F61" w:sz="18"/>
+          <w:bottom w:val="single" w:color="E8D5DA" w:sz="4"/>
+          <w:right w:val="single" w:color="E8D5DA" w:sz="4"/>
+          <w:insideH w:val="none" w:color="FFFFFF" w:sz="0"/>
+          <w:insideV w:val="none" w:color="FFFFFF" w:sz="0"/>
+        </w:tblBorders>
+      </w:tblPr>
+      <w:tblGrid>
+        <w:gridCol w:w="9700"/>
+      </w:tblGrid>
+      <w:tr>
+        <w:trPr>
+          <w:cantSplit/>
+        </w:trPr>
+        <w:tc>
+          <w:tcPr>
+            <w:tcW w:type="dxa" w:w="9700"/>
+            <w:shd w:fill="FDF9F9" w:val="clear"/>
+            <w:tcMar>
+              <w:top w:type="dxa" w:w="100"/>
+              <w:left w:type="dxa" w:w="160"/>
+              <w:bottom w:type="dxa" w:w="100"/>
+              <w:right w:type="dxa" w:w="160"/>
+            </w:tcMar>
+          </w:tcPr>
+          <w:p>
+            <w:pPr>
+              <w:spacing w:after="40" w:before="60"/>
+            </w:pPr>
+            <w:r>
+              <w:rPr>
+                <w:b/>
+                <w:bCs/>
+                <w:color w:val="D63F61"/>
+                <w:sz w:val="21"/>
+                <w:szCs w:val="21"/>
+              </w:rPr>
+              <w:t xml:space="preserve">▢  </w:t>
+            </w:r>
+            <w:r>
+              <w:rPr>
+                <w:b/>
+                <w:bCs/>
+                <w:color w:val="1A1A1A"/>
+                <w:sz w:val="21"/>
+                <w:szCs w:val="21"/>
+              </w:rPr>
+              <w:t xml:space="preserve">Какие 2–3 услуги приносят основную выручку и должны звучать громче остальных</w:t>
+            </w:r>
+          </w:p>
+          <w:p>
+            <w:pPr>
+              <w:spacing w:after="100"/>
+              <w:ind w:left="260"/>
+            </w:pPr>
+            <w:r>
+              <w:rPr>
+                <w:i/>
+                <w:iCs/>
+                <w:color w:val="6E6E6E"/>
+                <w:sz w:val="19"/>
+                <w:szCs w:val="19"/>
+              </w:rPr>
+              <w:t xml:space="preserve">Стиль расставляет акценты: главная услуга получает больше визуального веса.</w:t>
+            </w:r>
+          </w:p>
+          <w:p>
+            <w:pPr>
+              <w:spacing w:after="60"/>
+              <w:ind w:left="260"/>
+            </w:pPr>
+            <w:r>
+              <w:rPr>
+                <w:sz w:val="21"/>
+                <w:szCs w:val="21"/>
+              </w:rPr>
+              <w:t xml:space="preserve"> </w:t>
+            </w:r>
+          </w:p>
+        </w:tc>
+      </w:tr>
+    </w:tbl>
+    <w:p>
+      <w:pPr>
+        <w:pStyle w:val="Heading1"/>
+        <w:keepNext/>
+        <w:pBdr>
+          <w:bottom w:val="single" w:color="D63F61" w:sz="8" w:space="6"/>
+        </w:pBdr>
+        <w:spacing w:after="140" w:before="400"/>
+      </w:pPr>
+      <w:r>
+        <w:rPr>
+          <w:b/>
+          <w:bCs/>
+          <w:color w:val="D63F61"/>
+          <w:sz w:val="26"/>
+          <w:szCs w:val="26"/>
+        </w:rPr>
+        <w:t xml:space="preserve">4  </w:t>
+      </w:r>
+      <w:r>
+        <w:rPr>
+          <w:b/>
+          <w:bCs/>
+          <w:color w:val="1A1A1A"/>
+          <w:sz w:val="26"/>
+          <w:szCs w:val="26"/>
+        </w:rPr>
+        <w:t xml:space="preserve">Что уже есть</w:t>
+      </w:r>
+    </w:p>
+    <w:p>
+      <w:pPr>
+        <w:pStyle w:val="Heading2"/>
+        <w:keepNext/>
+        <w:spacing w:after="90" w:before="220"/>
+      </w:pPr>
+      <w:r>
+        <w:rPr>
+          <w:b/>
+          <w:bCs/>
+          <w:color w:val="8A8443"/>
+          <w:sz w:val="22"/>
+          <w:szCs w:val="22"/>
+        </w:rPr>
+        <w:t xml:space="preserve">Логотип</w:t>
+      </w:r>
+    </w:p>
+    <w:p>
+      <w:pPr>
+        <w:spacing w:after="120" w:line="276"/>
+      </w:pPr>
+      <w:r>
+        <w:rPr>
+          <w:color w:val="1A1A1A"/>
+          <w:sz w:val="21"/>
+          <w:szCs w:val="21"/>
+        </w:rPr>
+        <w:t xml:space="preserve">Знак «1+1», построенный на мотиве канцелярской скрепки, в двух цветах — малиновый и оливковый. Под знаком дескриптор «АУТСОРСИНГ БУХГАЛТЕРИИ».</w:t>
+      </w:r>
+    </w:p>
+    <w:p>
+      <w:pPr>
+        <w:spacing w:after="120" w:line="276"/>
+      </w:pPr>
+      <w:r>
+        <w:rPr>
+          <w:color w:val="1A1A1A"/>
+          <w:sz w:val="21"/>
+          <w:szCs w:val="21"/>
+        </w:rPr>
+        <w:t xml:space="preserve">Логотип прилагается к брифу отдельным файлом. Цвета, снятые с макета: малиновый #D63F61, оливковый #ABAD59 (в дескрипторе — приглушённый оливковый #807A4A).</w:t>
+      </w:r>
+    </w:p>
+    <w:p>
+      <w:pPr>
+        <w:spacing w:after="80"/>
+      </w:pPr>
+      <w:r>
+        <w:rPr>
+          <w:color w:val="1A1A1A"/>
+          <w:sz w:val="21"/>
+          <w:szCs w:val="21"/>
+        </w:rPr>
+        <w:t xml:space="preserve"/>
+      </w:r>
+    </w:p>
+    <w:p>
+      <w:pPr>
+        <w:spacing w:after="120" w:line="276"/>
+      </w:pPr>
+      <w:r>
+        <w:rPr>
+          <w:b/>
+          <w:bCs/>
+          <w:color w:val="1A1A1A"/>
+          <w:sz w:val="21"/>
+          <w:szCs w:val="21"/>
+        </w:rPr>
+        <w:t xml:space="preserve">Статус логотипа в этом проекте — выбрать один вариант:</w:t>
+      </w:r>
+    </w:p>
+    <w:p>
+      <w:pPr>
+        <w:pStyle w:val="ListParagraph"/>
+        <w:numPr>
+          <w:ilvl w:val="0"/>
+          <w:numId w:val="2"/>
+        </w:numPr>
+        <w:spacing w:after="60" w:line="276"/>
+      </w:pPr>
+      <w:r>
+        <w:rPr>
+          <w:color w:val="1A1A1A"/>
+          <w:sz w:val="21"/>
+          <w:szCs w:val="21"/>
+        </w:rPr>
+        <w:t xml:space="preserve">▢  Логотип утверждён и не меняется. Фирменный стиль строится вокруг него.</w:t>
+      </w:r>
+    </w:p>
+    <w:p>
+      <w:pPr>
+        <w:pStyle w:val="ListParagraph"/>
+        <w:numPr>
+          <w:ilvl w:val="0"/>
+          <w:numId w:val="2"/>
+        </w:numPr>
+        <w:spacing w:after="60" w:line="276"/>
+      </w:pPr>
+      <w:r>
+        <w:rPr>
+          <w:color w:val="1A1A1A"/>
+          <w:sz w:val="21"/>
+          <w:szCs w:val="21"/>
+        </w:rPr>
+        <w:t xml:space="preserve">▢  Логотип сохраняется, но допускается техническая доработка: упрощение для мелких размеров, монохромная версия, корректировка пропорций и цвета. Идея и начертание остаются.</w:t>
+      </w:r>
+    </w:p>
+    <w:p>
+      <w:pPr>
+        <w:pStyle w:val="ListParagraph"/>
+        <w:numPr>
+          <w:ilvl w:val="0"/>
+          <w:numId w:val="2"/>
+        </w:numPr>
+        <w:spacing w:after="60" w:line="276"/>
+      </w:pPr>
+      <w:r>
+        <w:rPr>
+          <w:color w:val="1A1A1A"/>
+          <w:sz w:val="21"/>
+          <w:szCs w:val="21"/>
+        </w:rPr>
+        <w:t xml:space="preserve">▢  Логотип может быть переработан, если подрядчик обоснует, почему это необходимо. Название «1+1» неизменно.</w:t>
+      </w:r>
+    </w:p>
+    <w:p>
+      <w:pPr>
+        <w:spacing w:after="120"/>
+      </w:pPr>
+      <w:r>
+        <w:rPr>
+          <w:color w:val="1A1A1A"/>
+          <w:sz w:val="21"/>
+          <w:szCs w:val="21"/>
+        </w:rPr>
+        <w:t xml:space="preserve"/>
+      </w:r>
+    </w:p>
+    <w:p>
+      <w:pPr>
+        <w:spacing w:after="140" w:line="276"/>
+      </w:pPr>
+      <w:r>
+        <w:rPr>
+          <w:i/>
+          <w:iCs/>
+          <w:color w:val="6E6E6E"/>
+          <w:sz w:val="19"/>
+          <w:szCs w:val="19"/>
+        </w:rPr>
+        <w:t xml:space="preserve">Рекомендация: если в работе не участвует автор логотипа, второй вариант обычно самый практичный — он позволяет получить версии для фавикона, аватара соцсети, тиснения и вышивки, не начиная бренд с нуля.</w:t>
+      </w:r>
+    </w:p>
+    <w:p>
+      <w:pPr>
+        <w:pStyle w:val="Heading2"/>
+        <w:keepNext/>
+        <w:spacing w:after="90" w:before="220"/>
+      </w:pPr>
+      <w:r>
+        <w:rPr>
+          <w:b/>
+          <w:bCs/>
+          <w:color w:val="8A8443"/>
+          <w:sz w:val="22"/>
+          <w:szCs w:val="22"/>
+        </w:rPr>
+        <w:t xml:space="preserve">Сайт</w:t>
+      </w:r>
+    </w:p>
+    <w:p>
+      <w:pPr>
+        <w:spacing w:after="120" w:line="276"/>
+      </w:pPr>
+      <w:r>
+        <w:rPr>
+          <w:color w:val="1A1A1A"/>
+          <w:sz w:val="21"/>
+          <w:szCs w:val="21"/>
+        </w:rPr>
+        <w:t xml:space="preserve">1-plus-1.ru — работающий сайт. Редизайн в рамках этого проекта не заказывается.</w:t>
+      </w:r>
+    </w:p>
+    <w:p>
+      <w:pPr>
+        <w:spacing w:after="120" w:line="276"/>
+      </w:pPr>
+      <w:r>
+        <w:rPr>
+          <w:color w:val="1A1A1A"/>
+          <w:sz w:val="21"/>
+          <w:szCs w:val="21"/>
+        </w:rPr>
+        <w:t xml:space="preserve">На сайте уже сложился набор визуальных решений, но нигде не описан и существует только внутри вёрстки: за его пределами — в презентациях, документах, соцсетях — воспроизвести его нечем. Что используется сейчас:</w:t>
+      </w:r>
+    </w:p>
+    <w:p>
+      <w:pPr>
+        <w:pStyle w:val="ListParagraph"/>
+        <w:numPr>
+          <w:ilvl w:val="0"/>
+          <w:numId w:val="2"/>
+        </w:numPr>
+        <w:spacing w:after="60" w:line="276"/>
+      </w:pPr>
+      <w:r>
+        <w:rPr>
+          <w:color w:val="1A1A1A"/>
+          <w:sz w:val="21"/>
+          <w:szCs w:val="21"/>
+        </w:rPr>
+        <w:t xml:space="preserve">Цвета: оливковый и светло-зелёный как основа, малиновый как акцент и цвет целевого действия, чёрный для кнопок, светлый фон страницы</w:t>
+      </w:r>
+    </w:p>
+    <w:p>
+      <w:pPr>
+        <w:pStyle w:val="ListParagraph"/>
+        <w:numPr>
+          <w:ilvl w:val="0"/>
+          <w:numId w:val="2"/>
+        </w:numPr>
+        <w:spacing w:after="60" w:line="276"/>
+      </w:pPr>
+      <w:r>
+        <w:rPr>
+          <w:color w:val="1A1A1A"/>
+          <w:sz w:val="21"/>
+          <w:szCs w:val="21"/>
+        </w:rPr>
+        <w:t xml:space="preserve">Крупные скруглённые карточки на светлом фоне, тёмный подвал</w:t>
+      </w:r>
+    </w:p>
+    <w:p>
+      <w:pPr>
+        <w:pStyle w:val="ListParagraph"/>
+        <w:numPr>
+          <w:ilvl w:val="0"/>
+          <w:numId w:val="2"/>
+        </w:numPr>
+        <w:spacing w:after="60" w:line="276"/>
+      </w:pPr>
+      <w:r>
+        <w:rPr>
+          <w:color w:val="1A1A1A"/>
+          <w:sz w:val="21"/>
+          <w:szCs w:val="21"/>
+        </w:rPr>
+        <w:t xml:space="preserve">Линейные иконки оливкового цвета на светло-зелёных подложках</w:t>
+      </w:r>
+    </w:p>
+    <w:p>
+      <w:pPr>
+        <w:pStyle w:val="ListParagraph"/>
+        <w:numPr>
+          <w:ilvl w:val="0"/>
+          <w:numId w:val="2"/>
+        </w:numPr>
+        <w:spacing w:after="60" w:line="276"/>
+      </w:pPr>
+      <w:r>
+        <w:rPr>
+          <w:color w:val="1A1A1A"/>
+          <w:sz w:val="21"/>
+          <w:szCs w:val="21"/>
+        </w:rPr>
+        <w:t xml:space="preserve">Декоративные круги и полукруги в оливковой и розовой гамме</w:t>
+      </w:r>
+    </w:p>
+    <w:p>
+      <w:pPr>
+        <w:pStyle w:val="ListParagraph"/>
+        <w:numPr>
+          <w:ilvl w:val="0"/>
+          <w:numId w:val="2"/>
+        </w:numPr>
+        <w:spacing w:after="60" w:line="276"/>
+      </w:pPr>
+      <w:r>
+        <w:rPr>
+          <w:color w:val="1A1A1A"/>
+          <w:sz w:val="21"/>
+          <w:szCs w:val="21"/>
+        </w:rPr>
+        <w:t xml:space="preserve">Фотография сотрудника на цветной круглой подложке в первом экране</w:t>
+      </w:r>
+    </w:p>
+    <w:p>
+      <w:pPr>
+        <w:pStyle w:val="ListParagraph"/>
+        <w:numPr>
+          <w:ilvl w:val="0"/>
+          <w:numId w:val="2"/>
+        </w:numPr>
+        <w:spacing w:after="60" w:line="276"/>
+      </w:pPr>
+      <w:r>
+        <w:rPr>
+          <w:color w:val="1A1A1A"/>
+          <w:sz w:val="21"/>
+          <w:szCs w:val="21"/>
+        </w:rPr>
+        <w:t xml:space="preserve">Крупные числа как самостоятельный визуальный приём в блоке «Компания в цифрах»</w:t>
+      </w:r>
+    </w:p>
+    <w:p>
+      <w:pPr>
+        <w:pStyle w:val="ListParagraph"/>
+        <w:numPr>
+          <w:ilvl w:val="0"/>
+          <w:numId w:val="2"/>
+        </w:numPr>
+        <w:spacing w:after="60" w:line="276"/>
+      </w:pPr>
+      <w:r>
+        <w:rPr>
+          <w:color w:val="1A1A1A"/>
+          <w:sz w:val="21"/>
+          <w:szCs w:val="21"/>
+        </w:rPr>
+        <w:t xml:space="preserve">Логотип встроен прямо в заголовок первого экрана вместо слова</w:t>
+      </w:r>
+    </w:p>
+    <w:p>
+      <w:pPr>
+        <w:spacing w:after="80"/>
+      </w:pPr>
+      <w:r>
+        <w:rPr>
+          <w:color w:val="1A1A1A"/>
+          <w:sz w:val="21"/>
+          <w:szCs w:val="21"/>
+        </w:rPr>
+        <w:t xml:space="preserve"/>
+      </w:r>
+    </w:p>
+    <w:p>
+      <w:pPr>
+        <w:spacing w:after="120" w:line="276"/>
+      </w:pPr>
+      <w:r>
+        <w:rPr>
+          <w:color w:val="1A1A1A"/>
+          <w:sz w:val="21"/>
+          <w:szCs w:val="21"/>
+        </w:rPr>
+        <w:t xml:space="preserve">Подрядчику нужно решить, что из перечисленного войдёт в систему как есть, что будет переработано, а что уйдёт. Решение должно быть обосновано и зафиксировано в гайде — сейчас эти приёмы нигде не описаны и повторяются на глаз.</w:t>
+      </w:r>
+    </w:p>
+    <w:p>
+      <w:pPr>
+        <w:spacing w:after="80"/>
+      </w:pPr>
+      <w:r>
+        <w:rPr>
+          <w:color w:val="1A1A1A"/>
+          <w:sz w:val="21"/>
+          <w:szCs w:val="21"/>
+        </w:rPr>
+        <w:t xml:space="preserve"/>
+      </w:r>
+    </w:p>
+    <w:tbl>
+      <w:tblPr>
+        <w:tblW w:type="dxa" w:w="9700"/>
+        <w:tblBorders>
+          <w:top w:val="single" w:color="E8D5DA" w:sz="4"/>
+          <w:left w:val="single" w:color="D63F61" w:sz="18"/>
+          <w:bottom w:val="single" w:color="E8D5DA" w:sz="4"/>
+          <w:right w:val="single" w:color="E8D5DA" w:sz="4"/>
+          <w:insideH w:val="none" w:color="FFFFFF" w:sz="0"/>
+          <w:insideV w:val="none" w:color="FFFFFF" w:sz="0"/>
+        </w:tblBorders>
+      </w:tblPr>
+      <w:tblGrid>
+        <w:gridCol w:w="9700"/>
+      </w:tblGrid>
+      <w:tr>
+        <w:trPr>
+          <w:cantSplit/>
+        </w:trPr>
+        <w:tc>
+          <w:tcPr>
+            <w:tcW w:type="dxa" w:w="9700"/>
+            <w:shd w:fill="FDF9F9" w:val="clear"/>
+            <w:tcMar>
+              <w:top w:type="dxa" w:w="100"/>
+              <w:left w:type="dxa" w:w="160"/>
+              <w:bottom w:type="dxa" w:w="100"/>
+              <w:right w:type="dxa" w:w="160"/>
+            </w:tcMar>
+          </w:tcPr>
+          <w:p>
+            <w:pPr>
+              <w:spacing w:after="40" w:before="60"/>
+            </w:pPr>
+            <w:r>
+              <w:rPr>
+                <w:b/>
+                <w:bCs/>
+                <w:color w:val="D63F61"/>
+                <w:sz w:val="21"/>
+                <w:szCs w:val="21"/>
+              </w:rPr>
+              <w:t xml:space="preserve">▢  </w:t>
+            </w:r>
+            <w:r>
+              <w:rPr>
+                <w:b/>
+                <w:bCs/>
+                <w:color w:val="1A1A1A"/>
+                <w:sz w:val="21"/>
+                <w:szCs w:val="21"/>
+              </w:rPr>
+              <w:t xml:space="preserve">Что на сайте нужно сохранить обязательно</w:t>
+            </w:r>
+          </w:p>
+          <w:p>
+            <w:pPr>
+              <w:spacing w:after="100"/>
+              <w:ind w:left="260"/>
+            </w:pPr>
+            <w:r>
+              <w:rPr>
+                <w:i/>
+                <w:iCs/>
+                <w:color w:val="6E6E6E"/>
+                <w:sz w:val="19"/>
+                <w:szCs w:val="19"/>
+              </w:rPr>
+              <w:t xml:space="preserve">Например: структура, тексты, формы заявок, интеграции, оливково-малиновая гамма. Или: ничего, кроме логотипа.</w:t>
+            </w:r>
+          </w:p>
+          <w:p>
+            <w:pPr>
+              <w:spacing w:after="60"/>
+              <w:ind w:left="260"/>
+            </w:pPr>
+            <w:r>
+              <w:rPr>
+                <w:sz w:val="21"/>
+                <w:szCs w:val="21"/>
+              </w:rPr>
+              <w:t xml:space="preserve"> </w:t>
+            </w:r>
+          </w:p>
+        </w:tc>
+      </w:tr>
+    </w:tbl>
+    <w:p>
+      <w:pPr>
+        <w:pStyle w:val="Heading1"/>
+        <w:keepNext/>
+        <w:pBdr>
+          <w:bottom w:val="single" w:color="D63F61" w:sz="8" w:space="6"/>
+        </w:pBdr>
+        <w:spacing w:after="140" w:before="400"/>
+      </w:pPr>
+      <w:r>
+        <w:rPr>
+          <w:b/>
+          <w:bCs/>
+          <w:color w:val="D63F61"/>
+          <w:sz w:val="26"/>
+          <w:szCs w:val="26"/>
+        </w:rPr>
+        <w:t xml:space="preserve">5  </w:t>
+      </w:r>
+      <w:r>
+        <w:rPr>
+          <w:b/>
+          <w:bCs/>
+          <w:color w:val="1A1A1A"/>
+          <w:sz w:val="26"/>
+          <w:szCs w:val="26"/>
+        </w:rPr>
+        <w:t xml:space="preserve">Целевая аудитория</w:t>
+      </w:r>
+    </w:p>
+    <w:p>
+      <w:pPr>
+        <w:spacing w:after="120" w:line="276"/>
+      </w:pPr>
+      <w:r>
+        <w:rPr>
+          <w:color w:val="1A1A1A"/>
+          <w:sz w:val="21"/>
+          <w:szCs w:val="21"/>
+        </w:rPr>
+        <w:t xml:space="preserve">Ключевой раздел: стиль настраивается под того, кто принимает решение о найме бухгалтерии на аутсорс.</w:t>
+      </w:r>
+    </w:p>
+    <w:p>
+      <w:pPr>
+        <w:pStyle w:val="Heading2"/>
+        <w:keepNext/>
+        <w:spacing w:after="90" w:before="220"/>
+      </w:pPr>
+      <w:r>
+        <w:rPr>
+          <w:b/>
+          <w:bCs/>
+          <w:color w:val="8A8443"/>
+          <w:sz w:val="22"/>
+          <w:szCs w:val="22"/>
+        </w:rPr>
+        <w:t xml:space="preserve">Что известно</w:t>
+      </w:r>
+    </w:p>
+    <w:p>
+      <w:pPr>
+        <w:pStyle w:val="ListParagraph"/>
+        <w:numPr>
+          <w:ilvl w:val="0"/>
+          <w:numId w:val="2"/>
+        </w:numPr>
+        <w:spacing w:after="60" w:line="276"/>
+      </w:pPr>
+      <w:r>
+        <w:rPr>
+          <w:color w:val="1A1A1A"/>
+          <w:sz w:val="21"/>
+          <w:szCs w:val="21"/>
+        </w:rPr>
+        <w:t xml:space="preserve">Основное заявленное направление — малый и средний бизнес; отдельно есть пакет для крупного</w:t>
+      </w:r>
+    </w:p>
+    <w:p>
+      <w:pPr>
+        <w:pStyle w:val="ListParagraph"/>
+        <w:numPr>
+          <w:ilvl w:val="0"/>
+          <w:numId w:val="2"/>
+        </w:numPr>
+        <w:spacing w:after="60" w:line="276"/>
+      </w:pPr>
+      <w:r>
+        <w:rPr>
+          <w:color w:val="1A1A1A"/>
+          <w:sz w:val="21"/>
+          <w:szCs w:val="21"/>
+        </w:rPr>
+        <w:t xml:space="preserve">75% клиентов приходят по рекомендации: решение чаще принимается по чужому опыту, а не по рекламе</w:t>
+      </w:r>
+    </w:p>
+    <w:p>
+      <w:pPr>
+        <w:pStyle w:val="ListParagraph"/>
+        <w:numPr>
+          <w:ilvl w:val="0"/>
+          <w:numId w:val="2"/>
+        </w:numPr>
+        <w:spacing w:after="60" w:line="276"/>
+      </w:pPr>
+      <w:r>
+        <w:rPr>
+          <w:color w:val="1A1A1A"/>
+          <w:sz w:val="21"/>
+          <w:szCs w:val="21"/>
+        </w:rPr>
+        <w:t xml:space="preserve">Компания проводит консультации и обучения — часть аудитории приходит через экспертный контент</w:t>
+      </w:r>
+    </w:p>
+    <w:p>
+      <w:pPr>
+        <w:spacing w:after="60"/>
+      </w:pPr>
+      <w:r>
+        <w:rPr>
+          <w:color w:val="1A1A1A"/>
+          <w:sz w:val="21"/>
+          <w:szCs w:val="21"/>
+        </w:rPr>
+        <w:t xml:space="preserve"/>
+      </w:r>
+    </w:p>
+    <w:p>
+      <w:pPr>
+        <w:spacing w:after="140" w:line="276"/>
+      </w:pPr>
+      <w:r>
+        <w:rPr>
+          <w:i/>
+          <w:iCs/>
+          <w:color w:val="6E6E6E"/>
+          <w:sz w:val="19"/>
+          <w:szCs w:val="19"/>
+        </w:rPr>
+        <w:t xml:space="preserve">Вывод для подрядчика: материалы, которые клиент показывает знакомому — коммерческое предложение, презентация, отчёт, визитка — для нас важнее рекламных баннеров. Приоритет носителей стоит расставлять с учётом этого.</w:t>
+      </w:r>
+    </w:p>
+    <w:p>
+      <w:pPr>
+        <w:spacing w:after="80"/>
+      </w:pPr>
+      <w:r>
+        <w:rPr>
+          <w:color w:val="1A1A1A"/>
+          <w:sz w:val="21"/>
+          <w:szCs w:val="21"/>
+        </w:rPr>
+        <w:t xml:space="preserve"/>
+      </w:r>
+    </w:p>
+    <w:tbl>
+      <w:tblPr>
+        <w:tblW w:type="dxa" w:w="9700"/>
+        <w:tblBorders>
+          <w:top w:val="single" w:color="E8D5DA" w:sz="4"/>
+          <w:left w:val="single" w:color="D63F61" w:sz="18"/>
+          <w:bottom w:val="single" w:color="E8D5DA" w:sz="4"/>
+          <w:right w:val="single" w:color="E8D5DA" w:sz="4"/>
+          <w:insideH w:val="none" w:color="FFFFFF" w:sz="0"/>
+          <w:insideV w:val="none" w:color="FFFFFF" w:sz="0"/>
+        </w:tblBorders>
+      </w:tblPr>
+      <w:tblGrid>
+        <w:gridCol w:w="9700"/>
+      </w:tblGrid>
+      <w:tr>
+        <w:trPr>
+          <w:cantSplit/>
+        </w:trPr>
+        <w:tc>
+          <w:tcPr>
+            <w:tcW w:type="dxa" w:w="9700"/>
+            <w:shd w:fill="FDF9F9" w:val="clear"/>
+            <w:tcMar>
+              <w:top w:type="dxa" w:w="100"/>
+              <w:left w:type="dxa" w:w="160"/>
+              <w:bottom w:type="dxa" w:w="100"/>
+              <w:right w:type="dxa" w:w="160"/>
+            </w:tcMar>
+          </w:tcPr>
+          <w:p>
+            <w:pPr>
+              <w:spacing w:after="40" w:before="60"/>
+            </w:pPr>
+            <w:r>
+              <w:rPr>
+                <w:b/>
+                <w:bCs/>
+                <w:color w:val="D63F61"/>
+                <w:sz w:val="21"/>
+                <w:szCs w:val="21"/>
+              </w:rPr>
+              <w:t xml:space="preserve">▢  </w:t>
+            </w:r>
+            <w:r>
+              <w:rPr>
+                <w:b/>
+                <w:bCs/>
+                <w:color w:val="1A1A1A"/>
+                <w:sz w:val="21"/>
+                <w:szCs w:val="21"/>
+              </w:rPr>
+              <w:t xml:space="preserve">Кто наш клиент</w:t>
+            </w:r>
+          </w:p>
+          <w:p>
+            <w:pPr>
+              <w:spacing w:after="100"/>
+              <w:ind w:left="260"/>
+            </w:pPr>
+            <w:r>
+              <w:rPr>
+                <w:i/>
+                <w:iCs/>
+                <w:color w:val="6E6E6E"/>
+                <w:sz w:val="19"/>
+                <w:szCs w:val="19"/>
+              </w:rPr>
+              <w:t xml:space="preserve">Опишите 2–3 типа. Пример формата: «Собственник розничной сети, 35–50 лет, оборот до 150 млн, устал от текучки штатных бухгалтеров». Полезно указать отрасли: медицина, стоматология, торговля, общепит, производство, IT.</w:t>
             </w:r>
           </w:p>
           <w:p>
@@ -949,7 +2568,7 @@
                 <w:sz w:val="21"/>
                 <w:szCs w:val="21"/>
               </w:rPr>
-              <w:t xml:space="preserve">Планы на 2–3 года, которые стиль должен выдержать</w:t>
+              <w:t xml:space="preserve">Кто принимает решение и с чем он приходит</w:t>
             </w:r>
           </w:p>
           <w:p>
@@ -965,755 +2584,7 @@
                 <w:sz w:val="19"/>
                 <w:szCs w:val="19"/>
               </w:rPr>
-              <w:t xml:space="preserve">Например: выход в другие регионы, развитие «Бухдеска» как отдельного продукта, франшиза, работа с более крупным бизнесом. Если это планируется — стиль нужно закладывать с запасом.</w:t>
-            </w:r>
-          </w:p>
-          <w:p>
-            <w:pPr>
-              <w:spacing w:after="60"/>
-              <w:ind w:left="260"/>
-            </w:pPr>
-            <w:r>
-              <w:rPr>
-                <w:sz w:val="21"/>
-                <w:szCs w:val="21"/>
-              </w:rPr>
-              <w:t xml:space="preserve"> </w:t>
-            </w:r>
-          </w:p>
-        </w:tc>
-      </w:tr>
-    </w:tbl>
-    <w:p>
-      <w:pPr>
-        <w:pStyle w:val="Heading1"/>
-        <w:keepNext/>
-        <w:pBdr>
-          <w:bottom w:val="single" w:color="D63F61" w:sz="8" w:space="6"/>
-        </w:pBdr>
-        <w:spacing w:after="140" w:before="400"/>
-      </w:pPr>
-      <w:r>
-        <w:rPr>
-          <w:b/>
-          <w:bCs/>
-          <w:color w:val="D63F61"/>
-          <w:sz w:val="26"/>
-          <w:szCs w:val="26"/>
-        </w:rPr>
-        <w:t xml:space="preserve">3  </w:t>
-      </w:r>
-      <w:r>
-        <w:rPr>
-          <w:b/>
-          <w:bCs/>
-          <w:color w:val="1A1A1A"/>
-          <w:sz w:val="26"/>
-          <w:szCs w:val="26"/>
-        </w:rPr>
-        <w:t xml:space="preserve">Услуги</w:t>
-      </w:r>
-    </w:p>
-    <w:p>
-      <w:pPr>
-        <w:spacing w:after="120" w:line="276"/>
-      </w:pPr>
-      <w:r>
-        <w:rPr>
-          <w:color w:val="1A1A1A"/>
-          <w:sz w:val="21"/>
-          <w:szCs w:val="21"/>
-        </w:rPr>
-        <w:t xml:space="preserve">Направления, которые нужно уметь визуально различать в материалах (иконки, разделы сайта, презентации, папки документов):</w:t>
-      </w:r>
-    </w:p>
-    <w:p>
-      <w:pPr>
-        <w:pStyle w:val="ListParagraph"/>
-        <w:numPr>
-          <w:ilvl w:val="0"/>
-          <w:numId w:val="2"/>
-        </w:numPr>
-        <w:spacing w:after="60" w:line="276"/>
-      </w:pPr>
-      <w:r>
-        <w:rPr>
-          <w:color w:val="1A1A1A"/>
-          <w:sz w:val="21"/>
-          <w:szCs w:val="21"/>
-        </w:rPr>
-        <w:t xml:space="preserve">Бухгалтерское обслуживание на аутсорсе</w:t>
-      </w:r>
-    </w:p>
-    <w:p>
-      <w:pPr>
-        <w:pStyle w:val="ListParagraph"/>
-        <w:numPr>
-          <w:ilvl w:val="0"/>
-          <w:numId w:val="2"/>
-        </w:numPr>
-        <w:spacing w:after="60" w:line="276"/>
-      </w:pPr>
-      <w:r>
-        <w:rPr>
-          <w:color w:val="1A1A1A"/>
-          <w:sz w:val="21"/>
-          <w:szCs w:val="21"/>
-        </w:rPr>
-        <w:t xml:space="preserve">Налоговый консалтинг и оптимизация налогообложения</w:t>
-      </w:r>
-    </w:p>
-    <w:p>
-      <w:pPr>
-        <w:pStyle w:val="ListParagraph"/>
-        <w:numPr>
-          <w:ilvl w:val="0"/>
-          <w:numId w:val="2"/>
-        </w:numPr>
-        <w:spacing w:after="60" w:line="276"/>
-      </w:pPr>
-      <w:r>
-        <w:rPr>
-          <w:color w:val="1A1A1A"/>
-          <w:sz w:val="21"/>
-          <w:szCs w:val="21"/>
-        </w:rPr>
-        <w:t xml:space="preserve">Финансовый консалтинг, управленческий учёт</w:t>
-      </w:r>
-    </w:p>
-    <w:p>
-      <w:pPr>
-        <w:pStyle w:val="ListParagraph"/>
-        <w:numPr>
-          <w:ilvl w:val="0"/>
-          <w:numId w:val="2"/>
-        </w:numPr>
-        <w:spacing w:after="60" w:line="276"/>
-      </w:pPr>
-      <w:r>
-        <w:rPr>
-          <w:color w:val="1A1A1A"/>
-          <w:sz w:val="21"/>
-          <w:szCs w:val="21"/>
-        </w:rPr>
-        <w:t xml:space="preserve">Юридическое сопровождение бизнеса</w:t>
-      </w:r>
-    </w:p>
-    <w:p>
-      <w:pPr>
-        <w:pStyle w:val="ListParagraph"/>
-        <w:numPr>
-          <w:ilvl w:val="0"/>
-          <w:numId w:val="2"/>
-        </w:numPr>
-        <w:spacing w:after="60" w:line="276"/>
-      </w:pPr>
-      <w:r>
-        <w:rPr>
-          <w:color w:val="1A1A1A"/>
-          <w:sz w:val="21"/>
-          <w:szCs w:val="21"/>
-        </w:rPr>
-        <w:t xml:space="preserve">Регистрация и ликвидация бизнеса</w:t>
-      </w:r>
-    </w:p>
-    <w:p>
-      <w:pPr>
-        <w:pStyle w:val="ListParagraph"/>
-        <w:numPr>
-          <w:ilvl w:val="0"/>
-          <w:numId w:val="2"/>
-        </w:numPr>
-        <w:spacing w:after="60" w:line="276"/>
-      </w:pPr>
-      <w:r>
-        <w:rPr>
-          <w:color w:val="1A1A1A"/>
-          <w:sz w:val="21"/>
-          <w:szCs w:val="21"/>
-        </w:rPr>
-        <w:t xml:space="preserve">Кадровый учёт, расчёт заработной платы</w:t>
-      </w:r>
-    </w:p>
-    <w:p>
-      <w:pPr>
-        <w:pStyle w:val="ListParagraph"/>
-        <w:numPr>
-          <w:ilvl w:val="0"/>
-          <w:numId w:val="2"/>
-        </w:numPr>
-        <w:spacing w:after="60" w:line="276"/>
-      </w:pPr>
-      <w:r>
-        <w:rPr>
-          <w:color w:val="1A1A1A"/>
-          <w:sz w:val="21"/>
-          <w:szCs w:val="21"/>
-        </w:rPr>
-        <w:t xml:space="preserve">Воинский учёт</w:t>
-      </w:r>
-    </w:p>
-    <w:p>
-      <w:pPr>
-        <w:pStyle w:val="ListParagraph"/>
-        <w:numPr>
-          <w:ilvl w:val="0"/>
-          <w:numId w:val="2"/>
-        </w:numPr>
-        <w:spacing w:after="60" w:line="276"/>
-      </w:pPr>
-      <w:r>
-        <w:rPr>
-          <w:color w:val="1A1A1A"/>
-          <w:sz w:val="21"/>
-          <w:szCs w:val="21"/>
-        </w:rPr>
-        <w:t xml:space="preserve">Регистрация товарных знаков</w:t>
-      </w:r>
-    </w:p>
-    <w:p>
-      <w:pPr>
-        <w:pStyle w:val="ListParagraph"/>
-        <w:numPr>
-          <w:ilvl w:val="0"/>
-          <w:numId w:val="2"/>
-        </w:numPr>
-        <w:spacing w:after="60" w:line="276"/>
-      </w:pPr>
-      <w:r>
-        <w:rPr>
-          <w:color w:val="1A1A1A"/>
-          <w:sz w:val="21"/>
-          <w:szCs w:val="21"/>
-        </w:rPr>
-        <w:t xml:space="preserve">Декларации 3-НДФЛ для физических лиц</w:t>
-      </w:r>
-    </w:p>
-    <w:p>
-      <w:pPr>
-        <w:spacing w:after="80"/>
-      </w:pPr>
-      <w:r>
-        <w:rPr>
-          <w:color w:val="1A1A1A"/>
-          <w:sz w:val="21"/>
-          <w:szCs w:val="21"/>
-        </w:rPr>
-        <w:t xml:space="preserve"/>
-      </w:r>
-    </w:p>
-    <w:tbl>
-      <w:tblPr>
-        <w:tblW w:type="dxa" w:w="9700"/>
-        <w:tblBorders>
-          <w:top w:val="single" w:color="E8D5DA" w:sz="4"/>
-          <w:left w:val="single" w:color="D63F61" w:sz="18"/>
-          <w:bottom w:val="single" w:color="E8D5DA" w:sz="4"/>
-          <w:right w:val="single" w:color="E8D5DA" w:sz="4"/>
-          <w:insideH w:val="none" w:color="FFFFFF" w:sz="0"/>
-          <w:insideV w:val="none" w:color="FFFFFF" w:sz="0"/>
-        </w:tblBorders>
-      </w:tblPr>
-      <w:tblGrid>
-        <w:gridCol w:w="9700"/>
-      </w:tblGrid>
-      <w:tr>
-        <w:trPr>
-          <w:cantSplit/>
-        </w:trPr>
-        <w:tc>
-          <w:tcPr>
-            <w:tcW w:type="dxa" w:w="9700"/>
-            <w:shd w:fill="FDF9F9" w:val="clear"/>
-            <w:tcMar>
-              <w:top w:type="dxa" w:w="100"/>
-              <w:left w:type="dxa" w:w="160"/>
-              <w:bottom w:type="dxa" w:w="100"/>
-              <w:right w:type="dxa" w:w="160"/>
-            </w:tcMar>
-          </w:tcPr>
-          <w:p>
-            <w:pPr>
-              <w:spacing w:after="40" w:before="60"/>
-            </w:pPr>
-            <w:r>
-              <w:rPr>
-                <w:b/>
-                <w:bCs/>
-                <w:color w:val="D63F61"/>
-                <w:sz w:val="21"/>
-                <w:szCs w:val="21"/>
-              </w:rPr>
-              <w:t xml:space="preserve">▢  </w:t>
-            </w:r>
-            <w:r>
-              <w:rPr>
-                <w:b/>
-                <w:bCs/>
-                <w:color w:val="1A1A1A"/>
-                <w:sz w:val="21"/>
-                <w:szCs w:val="21"/>
-              </w:rPr>
-              <w:t xml:space="preserve">Какие 2–3 услуги приносят основную выручку и должны звучать громче остальных</w:t>
-            </w:r>
-          </w:p>
-          <w:p>
-            <w:pPr>
-              <w:spacing w:after="100"/>
-              <w:ind w:left="260"/>
-            </w:pPr>
-            <w:r>
-              <w:rPr>
-                <w:i/>
-                <w:iCs/>
-                <w:color w:val="6E6E6E"/>
-                <w:sz w:val="19"/>
-                <w:szCs w:val="19"/>
-              </w:rPr>
-              <w:t xml:space="preserve">Стиль расставляет акценты: главная услуга получает больше визуального веса.</w:t>
-            </w:r>
-          </w:p>
-          <w:p>
-            <w:pPr>
-              <w:spacing w:after="60"/>
-              <w:ind w:left="260"/>
-            </w:pPr>
-            <w:r>
-              <w:rPr>
-                <w:sz w:val="21"/>
-                <w:szCs w:val="21"/>
-              </w:rPr>
-              <w:t xml:space="preserve"> </w:t>
-            </w:r>
-          </w:p>
-        </w:tc>
-      </w:tr>
-    </w:tbl>
-    <w:p>
-      <w:pPr>
-        <w:pStyle w:val="Heading1"/>
-        <w:keepNext/>
-        <w:pBdr>
-          <w:bottom w:val="single" w:color="D63F61" w:sz="8" w:space="6"/>
-        </w:pBdr>
-        <w:spacing w:after="140" w:before="400"/>
-      </w:pPr>
-      <w:r>
-        <w:rPr>
-          <w:b/>
-          <w:bCs/>
-          <w:color w:val="D63F61"/>
-          <w:sz w:val="26"/>
-          <w:szCs w:val="26"/>
-        </w:rPr>
-        <w:t xml:space="preserve">4  </w:t>
-      </w:r>
-      <w:r>
-        <w:rPr>
-          <w:b/>
-          <w:bCs/>
-          <w:color w:val="1A1A1A"/>
-          <w:sz w:val="26"/>
-          <w:szCs w:val="26"/>
-        </w:rPr>
-        <w:t xml:space="preserve">Что уже есть</w:t>
-      </w:r>
-    </w:p>
-    <w:p>
-      <w:pPr>
-        <w:pStyle w:val="Heading2"/>
-        <w:keepNext/>
-        <w:spacing w:after="90" w:before="220"/>
-      </w:pPr>
-      <w:r>
-        <w:rPr>
-          <w:b/>
-          <w:bCs/>
-          <w:color w:val="8A8443"/>
-          <w:sz w:val="22"/>
-          <w:szCs w:val="22"/>
-        </w:rPr>
-        <w:t xml:space="preserve">Логотип</w:t>
-      </w:r>
-    </w:p>
-    <w:p>
-      <w:pPr>
-        <w:spacing w:after="120" w:line="276"/>
-      </w:pPr>
-      <w:r>
-        <w:rPr>
-          <w:color w:val="1A1A1A"/>
-          <w:sz w:val="21"/>
-          <w:szCs w:val="21"/>
-        </w:rPr>
-        <w:t xml:space="preserve">Знак «1+1», построенный на мотиве канцелярской скрепки, в двух цветах — малиновый и оливковый. Под знаком дескриптор «АУТСОРСИНГ БУХГАЛТЕРИИ».</w:t>
-      </w:r>
-    </w:p>
-    <w:p>
-      <w:pPr>
-        <w:spacing w:after="120" w:line="276"/>
-      </w:pPr>
-      <w:r>
-        <w:rPr>
-          <w:color w:val="1A1A1A"/>
-          <w:sz w:val="21"/>
-          <w:szCs w:val="21"/>
-        </w:rPr>
-        <w:t xml:space="preserve">Логотип прилагается к брифу отдельным файлом. Цвета, снятые с макета: малиновый #D63F61, оливковый #ABAD59 (в дескрипторе — приглушённый оливковый #807A4A).</w:t>
-      </w:r>
-    </w:p>
-    <w:p>
-      <w:pPr>
-        <w:spacing w:after="80"/>
-      </w:pPr>
-      <w:r>
-        <w:rPr>
-          <w:color w:val="1A1A1A"/>
-          <w:sz w:val="21"/>
-          <w:szCs w:val="21"/>
-        </w:rPr>
-        <w:t xml:space="preserve"/>
-      </w:r>
-    </w:p>
-    <w:p>
-      <w:pPr>
-        <w:spacing w:after="120" w:line="276"/>
-      </w:pPr>
-      <w:r>
-        <w:rPr>
-          <w:b/>
-          <w:bCs/>
-          <w:color w:val="1A1A1A"/>
-          <w:sz w:val="21"/>
-          <w:szCs w:val="21"/>
-        </w:rPr>
-        <w:t xml:space="preserve">Статус логотипа в этом проекте — выбрать один вариант:</w:t>
-      </w:r>
-    </w:p>
-    <w:p>
-      <w:pPr>
-        <w:pStyle w:val="ListParagraph"/>
-        <w:numPr>
-          <w:ilvl w:val="0"/>
-          <w:numId w:val="2"/>
-        </w:numPr>
-        <w:spacing w:after="60" w:line="276"/>
-      </w:pPr>
-      <w:r>
-        <w:rPr>
-          <w:color w:val="1A1A1A"/>
-          <w:sz w:val="21"/>
-          <w:szCs w:val="21"/>
-        </w:rPr>
-        <w:t xml:space="preserve">▢  Логотип утверждён и не меняется. Фирменный стиль строится вокруг него.</w:t>
-      </w:r>
-    </w:p>
-    <w:p>
-      <w:pPr>
-        <w:pStyle w:val="ListParagraph"/>
-        <w:numPr>
-          <w:ilvl w:val="0"/>
-          <w:numId w:val="2"/>
-        </w:numPr>
-        <w:spacing w:after="60" w:line="276"/>
-      </w:pPr>
-      <w:r>
-        <w:rPr>
-          <w:color w:val="1A1A1A"/>
-          <w:sz w:val="21"/>
-          <w:szCs w:val="21"/>
-        </w:rPr>
-        <w:t xml:space="preserve">▢  Логотип сохраняется, но допускается техническая доработка: упрощение для мелких размеров, монохромная версия, корректировка пропорций и цвета. Идея и начертание остаются.</w:t>
-      </w:r>
-    </w:p>
-    <w:p>
-      <w:pPr>
-        <w:pStyle w:val="ListParagraph"/>
-        <w:numPr>
-          <w:ilvl w:val="0"/>
-          <w:numId w:val="2"/>
-        </w:numPr>
-        <w:spacing w:after="60" w:line="276"/>
-      </w:pPr>
-      <w:r>
-        <w:rPr>
-          <w:color w:val="1A1A1A"/>
-          <w:sz w:val="21"/>
-          <w:szCs w:val="21"/>
-        </w:rPr>
-        <w:t xml:space="preserve">▢  Логотип может быть переработан, если подрядчик обоснует, почему это необходимо. Название «1+1» неизменно.</w:t>
-      </w:r>
-    </w:p>
-    <w:p>
-      <w:pPr>
-        <w:spacing w:after="120"/>
-      </w:pPr>
-      <w:r>
-        <w:rPr>
-          <w:color w:val="1A1A1A"/>
-          <w:sz w:val="21"/>
-          <w:szCs w:val="21"/>
-        </w:rPr>
-        <w:t xml:space="preserve"/>
-      </w:r>
-    </w:p>
-    <w:p>
-      <w:pPr>
-        <w:spacing w:after="140" w:line="276"/>
-      </w:pPr>
-      <w:r>
-        <w:rPr>
-          <w:i/>
-          <w:iCs/>
-          <w:color w:val="6E6E6E"/>
-          <w:sz w:val="19"/>
-          <w:szCs w:val="19"/>
-        </w:rPr>
-        <w:t xml:space="preserve">Рекомендация: если в работе не участвует автор логотипа, второй вариант обычно самый практичный — он позволяет получить версии для фавикона, аватара соцсети, тиснения и вышивки, не начиная бренд с нуля.</w:t>
-      </w:r>
-    </w:p>
-    <w:p>
-      <w:pPr>
-        <w:pStyle w:val="Heading2"/>
-        <w:keepNext/>
-        <w:spacing w:after="90" w:before="220"/>
-      </w:pPr>
-      <w:r>
-        <w:rPr>
-          <w:b/>
-          <w:bCs/>
-          <w:color w:val="8A8443"/>
-          <w:sz w:val="22"/>
-          <w:szCs w:val="22"/>
-        </w:rPr>
-        <w:t xml:space="preserve">Сайт</w:t>
-      </w:r>
-    </w:p>
-    <w:p>
-      <w:pPr>
-        <w:spacing w:after="120" w:line="276"/>
-      </w:pPr>
-      <w:r>
-        <w:rPr>
-          <w:color w:val="1A1A1A"/>
-          <w:sz w:val="21"/>
-          <w:szCs w:val="21"/>
-        </w:rPr>
-        <w:t xml:space="preserve">1-plus-1.ru — основной канал привлечения. Работает, редизайн в рамках этого проекта не заказывается, но брендбук должен содержать раздел, по которому сайт можно будет привести к стилю позже.</w:t>
-      </w:r>
-    </w:p>
-    <w:p>
-      <w:pPr>
-        <w:spacing w:after="80"/>
-      </w:pPr>
-      <w:r>
-        <w:rPr>
-          <w:color w:val="1A1A1A"/>
-          <w:sz w:val="21"/>
-          <w:szCs w:val="21"/>
-        </w:rPr>
-        <w:t xml:space="preserve"/>
-      </w:r>
-    </w:p>
-    <w:tbl>
-      <w:tblPr>
-        <w:tblW w:type="dxa" w:w="9700"/>
-        <w:tblBorders>
-          <w:top w:val="single" w:color="E8D5DA" w:sz="4"/>
-          <w:left w:val="single" w:color="D63F61" w:sz="18"/>
-          <w:bottom w:val="single" w:color="E8D5DA" w:sz="4"/>
-          <w:right w:val="single" w:color="E8D5DA" w:sz="4"/>
-          <w:insideH w:val="none" w:color="FFFFFF" w:sz="0"/>
-          <w:insideV w:val="none" w:color="FFFFFF" w:sz="0"/>
-        </w:tblBorders>
-      </w:tblPr>
-      <w:tblGrid>
-        <w:gridCol w:w="9700"/>
-      </w:tblGrid>
-      <w:tr>
-        <w:trPr>
-          <w:cantSplit/>
-        </w:trPr>
-        <w:tc>
-          <w:tcPr>
-            <w:tcW w:type="dxa" w:w="9700"/>
-            <w:shd w:fill="FDF9F9" w:val="clear"/>
-            <w:tcMar>
-              <w:top w:type="dxa" w:w="100"/>
-              <w:left w:type="dxa" w:w="160"/>
-              <w:bottom w:type="dxa" w:w="100"/>
-              <w:right w:type="dxa" w:w="160"/>
-            </w:tcMar>
-          </w:tcPr>
-          <w:p>
-            <w:pPr>
-              <w:spacing w:after="40" w:before="60"/>
-            </w:pPr>
-            <w:r>
-              <w:rPr>
-                <w:b/>
-                <w:bCs/>
-                <w:color w:val="D63F61"/>
-                <w:sz w:val="21"/>
-                <w:szCs w:val="21"/>
-              </w:rPr>
-              <w:t xml:space="preserve">▢  </w:t>
-            </w:r>
-            <w:r>
-              <w:rPr>
-                <w:b/>
-                <w:bCs/>
-                <w:color w:val="1A1A1A"/>
-                <w:sz w:val="21"/>
-                <w:szCs w:val="21"/>
-              </w:rPr>
-              <w:t xml:space="preserve">Что на сайте нужно сохранить обязательно</w:t>
-            </w:r>
-          </w:p>
-          <w:p>
-            <w:pPr>
-              <w:spacing w:after="100"/>
-              <w:ind w:left="260"/>
-            </w:pPr>
-            <w:r>
-              <w:rPr>
-                <w:i/>
-                <w:iCs/>
-                <w:color w:val="6E6E6E"/>
-                <w:sz w:val="19"/>
-                <w:szCs w:val="19"/>
-              </w:rPr>
-              <w:t xml:space="preserve">Например: структура, тексты, формы заявок, интеграции. Или: ничего, кроме логотипа.</w:t>
-            </w:r>
-          </w:p>
-          <w:p>
-            <w:pPr>
-              <w:spacing w:after="60"/>
-              <w:ind w:left="260"/>
-            </w:pPr>
-            <w:r>
-              <w:rPr>
-                <w:sz w:val="21"/>
-                <w:szCs w:val="21"/>
-              </w:rPr>
-              <w:t xml:space="preserve"> </w:t>
-            </w:r>
-          </w:p>
-        </w:tc>
-      </w:tr>
-    </w:tbl>
-    <w:p>
-      <w:pPr>
-        <w:pStyle w:val="Heading1"/>
-        <w:keepNext/>
-        <w:pBdr>
-          <w:bottom w:val="single" w:color="D63F61" w:sz="8" w:space="6"/>
-        </w:pBdr>
-        <w:spacing w:after="140" w:before="400"/>
-      </w:pPr>
-      <w:r>
-        <w:rPr>
-          <w:b/>
-          <w:bCs/>
-          <w:color w:val="D63F61"/>
-          <w:sz w:val="26"/>
-          <w:szCs w:val="26"/>
-        </w:rPr>
-        <w:t xml:space="preserve">5  </w:t>
-      </w:r>
-      <w:r>
-        <w:rPr>
-          <w:b/>
-          <w:bCs/>
-          <w:color w:val="1A1A1A"/>
-          <w:sz w:val="26"/>
-          <w:szCs w:val="26"/>
-        </w:rPr>
-        <w:t xml:space="preserve">Целевая аудитория</w:t>
-      </w:r>
-    </w:p>
-    <w:p>
-      <w:pPr>
-        <w:spacing w:after="120" w:line="276"/>
-      </w:pPr>
-      <w:r>
-        <w:rPr>
-          <w:color w:val="1A1A1A"/>
-          <w:sz w:val="21"/>
-          <w:szCs w:val="21"/>
-        </w:rPr>
-        <w:t xml:space="preserve">Ключевой раздел: стиль настраивается под того, кто принимает решение о найме бухгалтерии на аутсорс.</w:t>
-      </w:r>
-    </w:p>
-    <w:tbl>
-      <w:tblPr>
-        <w:tblW w:type="dxa" w:w="9700"/>
-        <w:tblBorders>
-          <w:top w:val="single" w:color="E8D5DA" w:sz="4"/>
-          <w:left w:val="single" w:color="D63F61" w:sz="18"/>
-          <w:bottom w:val="single" w:color="E8D5DA" w:sz="4"/>
-          <w:right w:val="single" w:color="E8D5DA" w:sz="4"/>
-          <w:insideH w:val="none" w:color="FFFFFF" w:sz="0"/>
-          <w:insideV w:val="none" w:color="FFFFFF" w:sz="0"/>
-        </w:tblBorders>
-      </w:tblPr>
-      <w:tblGrid>
-        <w:gridCol w:w="9700"/>
-      </w:tblGrid>
-      <w:tr>
-        <w:trPr>
-          <w:cantSplit/>
-        </w:trPr>
-        <w:tc>
-          <w:tcPr>
-            <w:tcW w:type="dxa" w:w="9700"/>
-            <w:shd w:fill="FDF9F9" w:val="clear"/>
-            <w:tcMar>
-              <w:top w:type="dxa" w:w="100"/>
-              <w:left w:type="dxa" w:w="160"/>
-              <w:bottom w:type="dxa" w:w="100"/>
-              <w:right w:type="dxa" w:w="160"/>
-            </w:tcMar>
-          </w:tcPr>
-          <w:p>
-            <w:pPr>
-              <w:spacing w:after="40" w:before="60"/>
-            </w:pPr>
-            <w:r>
-              <w:rPr>
-                <w:b/>
-                <w:bCs/>
-                <w:color w:val="D63F61"/>
-                <w:sz w:val="21"/>
-                <w:szCs w:val="21"/>
-              </w:rPr>
-              <w:t xml:space="preserve">▢  </w:t>
-            </w:r>
-            <w:r>
-              <w:rPr>
-                <w:b/>
-                <w:bCs/>
-                <w:color w:val="1A1A1A"/>
-                <w:sz w:val="21"/>
-                <w:szCs w:val="21"/>
-              </w:rPr>
-              <w:t xml:space="preserve">Кто наш клиент</w:t>
-            </w:r>
-          </w:p>
-          <w:p>
-            <w:pPr>
-              <w:spacing w:after="100"/>
-              <w:ind w:left="260"/>
-            </w:pPr>
-            <w:r>
-              <w:rPr>
-                <w:i/>
-                <w:iCs/>
-                <w:color w:val="6E6E6E"/>
-                <w:sz w:val="19"/>
-                <w:szCs w:val="19"/>
-              </w:rPr>
-              <w:t xml:space="preserve">Опишите 2–3 типа. Пример формата: «Собственник розничной сети, 35–50 лет, оборот до 150 млн, устал от текучки штатных бухгалтеров». Полезно указать отрасли: медицина, стоматология, торговля, общепит, производство, IT.</w:t>
+              <w:t xml:space="preserve">Собственник, финдиректор, директор? Приходит от боли (штрафы, блокировка счёта, увольнение бухгалтера) или планово (открывает бизнес, растёт)?</w:t>
             </w:r>
           </w:p>
           <w:p>
@@ -1784,7 +2655,7 @@
                 <w:sz w:val="21"/>
                 <w:szCs w:val="21"/>
               </w:rPr>
-              <w:t xml:space="preserve">Кто принимает решение и с чем он приходит</w:t>
+              <w:t xml:space="preserve">Чего клиент боится при выборе аутсорсера</w:t>
             </w:r>
           </w:p>
           <w:p>
@@ -1800,7 +2671,7 @@
                 <w:sz w:val="19"/>
                 <w:szCs w:val="19"/>
               </w:rPr>
-              <w:t xml:space="preserve">Собственник, финдиректор, директор? Приходит от боли (штрафы, блокировка счёта, увольнение бухгалтера) или планово (открывает бизнес, растёт)?</w:t>
+              <w:t xml:space="preserve">Например: «сольют данные», «пропустят срок», «формально отпишутся», «дороже, чем свой бухгалтер», «не разберутся в моей отрасли». Стиль должен снимать именно эти страхи.</w:t>
             </w:r>
           </w:p>
           <w:p>
@@ -1871,7 +2742,7 @@
                 <w:sz w:val="21"/>
                 <w:szCs w:val="21"/>
               </w:rPr>
-              <w:t xml:space="preserve">Чего клиент боится при выборе аутсорсера</w:t>
+              <w:t xml:space="preserve">Откуда приходят остальные 25% клиентов</w:t>
             </w:r>
           </w:p>
           <w:p>
@@ -1887,94 +2758,7 @@
                 <w:sz w:val="19"/>
                 <w:szCs w:val="19"/>
               </w:rPr>
-              <w:t xml:space="preserve">Например: «сольют данные», «пропустят срок», «формально отпишутся», «дороже, чем свой бухгалтер», «не разберутся в моей отрасли». Стиль должен снимать именно эти страхи.</w:t>
-            </w:r>
-          </w:p>
-          <w:p>
-            <w:pPr>
-              <w:spacing w:after="60"/>
-              <w:ind w:left="260"/>
-            </w:pPr>
-            <w:r>
-              <w:rPr>
-                <w:sz w:val="21"/>
-                <w:szCs w:val="21"/>
-              </w:rPr>
-              <w:t xml:space="preserve"> </w:t>
-            </w:r>
-          </w:p>
-        </w:tc>
-      </w:tr>
-    </w:tbl>
-    <w:tbl>
-      <w:tblPr>
-        <w:tblW w:type="dxa" w:w="9700"/>
-        <w:tblBorders>
-          <w:top w:val="single" w:color="E8D5DA" w:sz="4"/>
-          <w:left w:val="single" w:color="D63F61" w:sz="18"/>
-          <w:bottom w:val="single" w:color="E8D5DA" w:sz="4"/>
-          <w:right w:val="single" w:color="E8D5DA" w:sz="4"/>
-          <w:insideH w:val="none" w:color="FFFFFF" w:sz="0"/>
-          <w:insideV w:val="none" w:color="FFFFFF" w:sz="0"/>
-        </w:tblBorders>
-      </w:tblPr>
-      <w:tblGrid>
-        <w:gridCol w:w="9700"/>
-      </w:tblGrid>
-      <w:tr>
-        <w:trPr>
-          <w:cantSplit/>
-        </w:trPr>
-        <w:tc>
-          <w:tcPr>
-            <w:tcW w:type="dxa" w:w="9700"/>
-            <w:shd w:fill="FDF9F9" w:val="clear"/>
-            <w:tcMar>
-              <w:top w:type="dxa" w:w="100"/>
-              <w:left w:type="dxa" w:w="160"/>
-              <w:bottom w:type="dxa" w:w="100"/>
-              <w:right w:type="dxa" w:w="160"/>
-            </w:tcMar>
-          </w:tcPr>
-          <w:p>
-            <w:pPr>
-              <w:spacing w:after="40" w:before="60"/>
-            </w:pPr>
-            <w:r>
-              <w:rPr>
-                <w:b/>
-                <w:bCs/>
-                <w:color w:val="D63F61"/>
-                <w:sz w:val="21"/>
-                <w:szCs w:val="21"/>
-              </w:rPr>
-              <w:t xml:space="preserve">▢  </w:t>
-            </w:r>
-            <w:r>
-              <w:rPr>
-                <w:b/>
-                <w:bCs/>
-                <w:color w:val="1A1A1A"/>
-                <w:sz w:val="21"/>
-                <w:szCs w:val="21"/>
-              </w:rPr>
-              <w:t xml:space="preserve">Откуда клиенты приходят чаще всего</w:t>
-            </w:r>
-          </w:p>
-          <w:p>
-            <w:pPr>
-              <w:spacing w:after="100"/>
-              <w:ind w:left="260"/>
-            </w:pPr>
-            <w:r>
-              <w:rPr>
-                <w:i/>
-                <w:iCs/>
-                <w:color w:val="6E6E6E"/>
-                <w:sz w:val="19"/>
-                <w:szCs w:val="19"/>
-              </w:rPr>
-              <w:t xml:space="preserve">Сарафан, сайт и поиск, соцсети, мероприятия, партнёры. От этого зависит, какие носители делать в первую очередь.</w:t>
+              <w:t xml:space="preserve">Сайт и поиск, соцсети, мероприятия, партнёры, обучения. От этого зависит, какие носители делать в первую очередь.</w:t>
             </w:r>
           </w:p>
           <w:p>
@@ -4033,7 +4817,43 @@
           <w:sz w:val="21"/>
           <w:szCs w:val="21"/>
         </w:rPr>
-        <w:t xml:space="preserve">▢  Раздел с рекомендациями по оформлению сайта: кнопки, заголовки, формы, цвета</w:t>
+        <w:t xml:space="preserve">▢  Раздел с рекомендациями по оформлению сайта: кнопки, заголовки, карточки, формы, цвета</w:t>
+      </w:r>
+    </w:p>
+    <w:p>
+      <w:pPr>
+        <w:pStyle w:val="ListParagraph"/>
+        <w:numPr>
+          <w:ilvl w:val="0"/>
+          <w:numId w:val="2"/>
+        </w:numPr>
+        <w:spacing w:after="60" w:line="276"/>
+      </w:pPr>
+      <w:r>
+        <w:rPr>
+          <w:color w:val="1A1A1A"/>
+          <w:sz w:val="21"/>
+          <w:szCs w:val="21"/>
+        </w:rPr>
+        <w:t xml:space="preserve">▢  Шаблон подачи показателей: блок «Компания в цифрах», инфографика, результаты в цифрах</w:t>
+      </w:r>
+    </w:p>
+    <w:p>
+      <w:pPr>
+        <w:pStyle w:val="ListParagraph"/>
+        <w:numPr>
+          <w:ilvl w:val="0"/>
+          <w:numId w:val="2"/>
+        </w:numPr>
+        <w:spacing w:after="60" w:line="276"/>
+      </w:pPr>
+      <w:r>
+        <w:rPr>
+          <w:color w:val="1A1A1A"/>
+          <w:sz w:val="21"/>
+          <w:szCs w:val="21"/>
+        </w:rPr>
+        <w:t xml:space="preserve">▢  Шаблон оформления кейсов: задача, что сделали, результат</w:t>
       </w:r>
     </w:p>
     <w:p>
@@ -4194,6 +5014,59 @@
           <w:szCs w:val="21"/>
         </w:rPr>
         <w:t xml:space="preserve">▢  Подарочная упаковка и открытки для клиентов</w:t>
+      </w:r>
+    </w:p>
+    <w:p>
+      <w:pPr>
+        <w:pStyle w:val="Heading2"/>
+        <w:keepNext/>
+        <w:spacing w:after="90" w:before="220"/>
+      </w:pPr>
+      <w:r>
+        <w:rPr>
+          <w:b/>
+          <w:bCs/>
+          <w:color w:val="8A8443"/>
+          <w:sz w:val="22"/>
+          <w:szCs w:val="22"/>
+        </w:rPr>
+        <w:t xml:space="preserve">VI. HR и обучающие материалы</w:t>
+      </w:r>
+    </w:p>
+    <w:p>
+      <w:pPr>
+        <w:pStyle w:val="ListParagraph"/>
+        <w:numPr>
+          <w:ilvl w:val="0"/>
+          <w:numId w:val="2"/>
+        </w:numPr>
+        <w:spacing w:after="60" w:line="276"/>
+      </w:pPr>
+      <w:r>
+        <w:rPr>
+          <w:color w:val="1A1A1A"/>
+          <w:sz w:val="21"/>
+          <w:szCs w:val="21"/>
+        </w:rPr>
+        <w:t xml:space="preserve">▢  Оформление вакансий и материалов для найма</w:t>
+      </w:r>
+    </w:p>
+    <w:p>
+      <w:pPr>
+        <w:pStyle w:val="ListParagraph"/>
+        <w:numPr>
+          <w:ilvl w:val="0"/>
+          <w:numId w:val="2"/>
+        </w:numPr>
+        <w:spacing w:after="60" w:line="276"/>
+      </w:pPr>
+      <w:r>
+        <w:rPr>
+          <w:color w:val="1A1A1A"/>
+          <w:sz w:val="21"/>
+          <w:szCs w:val="21"/>
+        </w:rPr>
+        <w:t xml:space="preserve">▢  Оформление обучений, вебинаров и консультаций, которые проводит компания</w:t>
       </w:r>
     </w:p>
     <w:p>

</xml_diff>